<commit_message>
Add rolling wheel-strategy analysis for dual investment products
Adds section 6.4 (with cross-reference in section 7.4) to the report:
after a Dual Investment position converts to BTC, re-selling a "Sell
High" at the same strike each cycle can recover the nominal principal
plus accumulated premium once price reverts to the strike (worked
3-round example). Adds the offsetting scenario where price stays below
strike for an extended period: premium shrinks as the position drifts
further OTM, and FVTPL fair-value accounting still requires recognizing
the unrealized markdown each period even though no loss is "realized."
Mirrors this into the executive PPTX as a new slide (deck now 15 pages).

Co-Authored-By: Claude Sonnet 5 <noreply@anthropic.com>
Claude-Session: https://claude.ai/code/session_01AE51ArwYZpfLqHAoebaBte
</commit_message>
<xml_diff>
--- a/reports/TSGEX_Five_Instrument_Yield_Optimization_Report.docx
+++ b/reports/TSGEX_Five_Instrument_Yield_Optimization_Report.docx
@@ -7440,7 +7440,7 @@
           <w:sz w:val="22"/>
           <w:szCs w:val="22"/>
         </w:rPr>
-        <w:t xml:space="preserve">6.4 財務運用場景</w:t>
+        <w:t xml:space="preserve">6.4 進階策略：轉換後之滾動掛單（"Wheel" 策略）</w:t>
       </w:r>
     </w:p>
     <w:p>
@@ -7453,7 +7453,7 @@
           <w:sz w:val="21"/>
           <w:szCs w:val="21"/>
         </w:rPr>
-        <w:t xml:space="preserve">1. </w:t>
+        <w:t xml:space="preserve">第 6.3 節之情境試算僅呈現「單一週期、到期即結算」之損益結果，惟實務上出借人（或此處應稱「權利金賣方」）於本金遭強制轉換為 BTC 後，</w:t>
       </w:r>
       <w:r>
         <w:rPr>
@@ -7463,16 +7463,1268 @@
           <w:sz w:val="21"/>
           <w:szCs w:val="21"/>
         </w:rPr>
-        <w:t xml:space="preserve">設定目標價逢低分批建倉：</w:t>
-      </w:r>
-      <w:r>
-        <w:rPr>
-          <w:rFonts w:ascii="Microsoft JhengHei" w:cs="Microsoft JhengHei" w:eastAsia="Microsoft JhengHei" w:hAnsi="Microsoft JhengHei"/>
-          <w:sz w:val="21"/>
-          <w:szCs w:val="21"/>
-        </w:rPr>
-        <w:t xml:space="preserve"> 若公司財務策略本即規劃以特定價位分批累積 BTC 現貨儲備，可透過「低買」結構於等待建倉價位期間同時賺取權利金，等同於「限價單 + 額外收益」之複合工具。</w:t>
-      </w:r>
+        <w:t xml:space="preserve">並非只能被動認列該週期之帳面跌幅</w:t>
+      </w:r>
+      <w:r>
+        <w:rPr>
+          <w:rFonts w:ascii="Microsoft JhengHei" w:cs="Microsoft JhengHei" w:eastAsia="Microsoft JhengHei" w:hAnsi="Microsoft JhengHei"/>
+          <w:sz w:val="21"/>
+          <w:szCs w:val="21"/>
+        </w:rPr>
+        <w:t xml:space="preserve">，而可持續以持有之 BTC 反向掛出「高賣（Sell High）」，並將行使價設定於</w:t>
+      </w:r>
+      <w:r>
+        <w:rPr>
+          <w:rFonts w:ascii="Microsoft JhengHei" w:cs="Microsoft JhengHei" w:eastAsia="Microsoft JhengHei" w:hAnsi="Microsoft JhengHei"/>
+          <w:b/>
+          <w:bCs/>
+          <w:sz w:val="21"/>
+          <w:szCs w:val="21"/>
+        </w:rPr>
+        <w:t xml:space="preserve">原始轉換價</w:t>
+      </w:r>
+      <w:r>
+        <w:rPr>
+          <w:rFonts w:ascii="Microsoft JhengHei" w:cs="Microsoft JhengHei" w:eastAsia="Microsoft JhengHei" w:hAnsi="Microsoft JhengHei"/>
+          <w:sz w:val="21"/>
+          <w:szCs w:val="21"/>
+        </w:rPr>
+        <w:t xml:space="preserve">，藉此在等待價格反彈期間持續收取權利金；若價格最終確實回升至原轉換價，該筆 BTC 將依原價轉換回 USDT，本金名目金額得以完整取回，並額外累積多期權利金收入。此操作本質上即選擇權交易中常見之「</w:t>
+      </w:r>
+      <w:r>
+        <w:rPr>
+          <w:rFonts w:ascii="Microsoft JhengHei" w:cs="Microsoft JhengHei" w:eastAsia="Microsoft JhengHei" w:hAnsi="Microsoft JhengHei"/>
+          <w:b/>
+          <w:bCs/>
+          <w:sz w:val="21"/>
+          <w:szCs w:val="21"/>
+        </w:rPr>
+        <w:t xml:space="preserve">Covered Call 輪動策略（Wheel Strategy）</w:t>
+      </w:r>
+      <w:r>
+        <w:rPr>
+          <w:rFonts w:ascii="Microsoft JhengHei" w:cs="Microsoft JhengHei" w:eastAsia="Microsoft JhengHei" w:hAnsi="Microsoft JhengHei"/>
+          <w:sz w:val="21"/>
+          <w:szCs w:val="21"/>
+        </w:rPr>
+        <w:t xml:space="preserve">」，並非本報告新增之風險，而是同一衍生性商品部位之</w:t>
+      </w:r>
+      <w:r>
+        <w:rPr>
+          <w:rFonts w:ascii="Microsoft JhengHei" w:cs="Microsoft JhengHei" w:eastAsia="Microsoft JhengHei" w:hAnsi="Microsoft JhengHei"/>
+          <w:b/>
+          <w:bCs/>
+          <w:sz w:val="21"/>
+          <w:szCs w:val="21"/>
+        </w:rPr>
+        <w:t xml:space="preserve">後續管理方式</w:t>
+      </w:r>
+      <w:r>
+        <w:rPr>
+          <w:rFonts w:ascii="Microsoft JhengHei" w:cs="Microsoft JhengHei" w:eastAsia="Microsoft JhengHei" w:hAnsi="Microsoft JhengHei"/>
+          <w:sz w:val="21"/>
+          <w:szCs w:val="21"/>
+        </w:rPr>
+        <w:t xml:space="preserve">，故獨立成節說明其損益動態與限制。</w:t>
+      </w:r>
+    </w:p>
+    <w:p>
+      <w:pPr>
+        <w:pStyle w:val="Heading4"/>
+        <w:spacing w:after="100" w:before="180"/>
+      </w:pPr>
+      <w:r>
+        <w:rPr>
+          <w:rFonts w:ascii="Microsoft JhengHei" w:cs="Microsoft JhengHei" w:eastAsia="Microsoft JhengHei" w:hAnsi="Microsoft JhengHei"/>
+          <w:b/>
+          <w:bCs/>
+          <w:color w:val="44546A"/>
+          <w:sz w:val="21"/>
+          <w:szCs w:val="21"/>
+        </w:rPr>
+        <w:t xml:space="preserve">6.4.1 順利路徑範例：三週後價格回升至轉換價</w:t>
+      </w:r>
+    </w:p>
+    <w:p>
+      <w:pPr>
+        <w:pBdr>
+          <w:left w:val="single" w:color="1F3864" w:sz="18"/>
+        </w:pBdr>
+        <w:shd w:fill="F2F2F2" w:val="clear"/>
+        <w:spacing w:after="200" w:before="120"/>
+        <w:ind w:left="360"/>
+      </w:pPr>
+      <w:r>
+        <w:rPr>
+          <w:rFonts w:ascii="Microsoft JhengHei" w:cs="Microsoft JhengHei" w:eastAsia="Microsoft JhengHei" w:hAnsi="Microsoft JhengHei"/>
+          <w:i/>
+          <w:iCs/>
+          <w:sz w:val="21"/>
+          <w:szCs w:val="21"/>
+        </w:rPr>
+        <w:t xml:space="preserve">以下同樣為</w:t>
+      </w:r>
+      <w:r>
+        <w:rPr>
+          <w:rFonts w:ascii="Microsoft JhengHei" w:cs="Microsoft JhengHei" w:eastAsia="Microsoft JhengHei" w:hAnsi="Microsoft JhengHei"/>
+          <w:b/>
+          <w:bCs/>
+          <w:i/>
+          <w:iCs/>
+          <w:sz w:val="21"/>
+          <w:szCs w:val="21"/>
+        </w:rPr>
+        <w:t xml:space="preserve">示意性範例</w:t>
+      </w:r>
+      <w:r>
+        <w:rPr>
+          <w:rFonts w:ascii="Microsoft JhengHei" w:cs="Microsoft JhengHei" w:eastAsia="Microsoft JhengHei" w:hAnsi="Microsoft JhengHei"/>
+          <w:i/>
+          <w:iCs/>
+          <w:sz w:val="21"/>
+          <w:szCs w:val="21"/>
+        </w:rPr>
+        <w:t xml:space="preserve">，用以展示滾動掛單之損益動態，非市場預測。假設本金 $1,000,000，原始轉換價（行使價）統一設定為 </w:t>
+      </w:r>
+      <w:r>
+        <w:rPr>
+          <w:rFonts w:ascii="Microsoft JhengHei" w:cs="Microsoft JhengHei" w:eastAsia="Microsoft JhengHei" w:hAnsi="Microsoft JhengHei"/>
+          <w:b/>
+          <w:bCs/>
+          <w:i/>
+          <w:iCs/>
+          <w:sz w:val="21"/>
+          <w:szCs w:val="21"/>
+        </w:rPr>
+        <w:t xml:space="preserve">$55,900</w:t>
+      </w:r>
+      <w:r>
+        <w:rPr>
+          <w:rFonts w:ascii="Microsoft JhengHei" w:cs="Microsoft JhengHei" w:eastAsia="Microsoft JhengHei" w:hAnsi="Microsoft JhengHei"/>
+          <w:i/>
+          <w:iCs/>
+          <w:sz w:val="21"/>
+          <w:szCs w:val="21"/>
+        </w:rPr>
+        <w:t xml:space="preserve">。</w:t>
+      </w:r>
+    </w:p>
+    <w:tbl>
+      <w:tblPr>
+        <w:tblW w:type="dxa" w:w="9350"/>
+        <w:tblBorders>
+          <w:top w:val="single" w:color="auto" w:sz="4"/>
+          <w:left w:val="single" w:color="auto" w:sz="4"/>
+          <w:bottom w:val="single" w:color="auto" w:sz="4"/>
+          <w:right w:val="single" w:color="auto" w:sz="4"/>
+          <w:insideH w:val="single" w:color="auto" w:sz="4"/>
+          <w:insideV w:val="single" w:color="auto" w:sz="4"/>
+        </w:tblBorders>
+      </w:tblPr>
+      <w:tblGrid>
+        <w:gridCol w:w="1168"/>
+        <w:gridCol w:w="1168"/>
+        <w:gridCol w:w="1168"/>
+        <w:gridCol w:w="1168"/>
+        <w:gridCol w:w="1168"/>
+        <w:gridCol w:w="1168"/>
+        <w:gridCol w:w="1168"/>
+        <w:gridCol w:w="1174"/>
+      </w:tblGrid>
+      <w:tr>
+        <w:trPr>
+          <w:tblHeader/>
+        </w:trPr>
+        <w:tc>
+          <w:tcPr>
+            <w:tcW w:type="dxa" w:w="1168"/>
+            <w:tcBorders>
+              <w:top w:val="single" w:color="9DB3C8" w:sz="4"/>
+              <w:left w:val="single" w:color="9DB3C8" w:sz="4"/>
+              <w:bottom w:val="single" w:color="9DB3C8" w:sz="4"/>
+              <w:right w:val="single" w:color="9DB3C8" w:sz="4"/>
+            </w:tcBorders>
+            <w:shd w:fill="1F3864" w:val="clear"/>
+            <w:tcMar>
+              <w:top w:type="dxa" w:w="80"/>
+              <w:left w:type="dxa" w:w="100"/>
+              <w:bottom w:type="dxa" w:w="80"/>
+              <w:right w:type="dxa" w:w="100"/>
+            </w:tcMar>
+            <w:vAlign w:val="center"/>
+          </w:tcPr>
+          <w:p>
+            <w:r>
+              <w:rPr>
+                <w:rFonts w:ascii="Microsoft JhengHei" w:cs="Microsoft JhengHei" w:eastAsia="Microsoft JhengHei" w:hAnsi="Microsoft JhengHei"/>
+                <w:b/>
+                <w:bCs/>
+                <w:color w:val="FFFFFF"/>
+                <w:sz w:val="19"/>
+                <w:szCs w:val="19"/>
+              </w:rPr>
+              <w:t xml:space="preserve">週期</w:t>
+            </w:r>
+          </w:p>
+        </w:tc>
+        <w:tc>
+          <w:tcPr>
+            <w:tcW w:type="dxa" w:w="1168"/>
+            <w:tcBorders>
+              <w:top w:val="single" w:color="9DB3C8" w:sz="4"/>
+              <w:left w:val="single" w:color="9DB3C8" w:sz="4"/>
+              <w:bottom w:val="single" w:color="9DB3C8" w:sz="4"/>
+              <w:right w:val="single" w:color="9DB3C8" w:sz="4"/>
+            </w:tcBorders>
+            <w:shd w:fill="1F3864" w:val="clear"/>
+            <w:tcMar>
+              <w:top w:type="dxa" w:w="80"/>
+              <w:left w:type="dxa" w:w="100"/>
+              <w:bottom w:type="dxa" w:w="80"/>
+              <w:right w:type="dxa" w:w="100"/>
+            </w:tcMar>
+            <w:vAlign w:val="center"/>
+          </w:tcPr>
+          <w:p>
+            <w:r>
+              <w:rPr>
+                <w:rFonts w:ascii="Microsoft JhengHei" w:cs="Microsoft JhengHei" w:eastAsia="Microsoft JhengHei" w:hAnsi="Microsoft JhengHei"/>
+                <w:b/>
+                <w:bCs/>
+                <w:color w:val="FFFFFF"/>
+                <w:sz w:val="19"/>
+                <w:szCs w:val="19"/>
+              </w:rPr>
+              <w:t xml:space="preserve">操作</w:t>
+            </w:r>
+          </w:p>
+        </w:tc>
+        <w:tc>
+          <w:tcPr>
+            <w:tcW w:type="dxa" w:w="1168"/>
+            <w:tcBorders>
+              <w:top w:val="single" w:color="9DB3C8" w:sz="4"/>
+              <w:left w:val="single" w:color="9DB3C8" w:sz="4"/>
+              <w:bottom w:val="single" w:color="9DB3C8" w:sz="4"/>
+              <w:right w:val="single" w:color="9DB3C8" w:sz="4"/>
+            </w:tcBorders>
+            <w:shd w:fill="1F3864" w:val="clear"/>
+            <w:tcMar>
+              <w:top w:type="dxa" w:w="80"/>
+              <w:left w:type="dxa" w:w="100"/>
+              <w:bottom w:type="dxa" w:w="80"/>
+              <w:right w:type="dxa" w:w="100"/>
+            </w:tcMar>
+            <w:vAlign w:val="center"/>
+          </w:tcPr>
+          <w:p>
+            <w:r>
+              <w:rPr>
+                <w:rFonts w:ascii="Microsoft JhengHei" w:cs="Microsoft JhengHei" w:eastAsia="Microsoft JhengHei" w:hAnsi="Microsoft JhengHei"/>
+                <w:b/>
+                <w:bCs/>
+                <w:color w:val="FFFFFF"/>
+                <w:sz w:val="19"/>
+                <w:szCs w:val="19"/>
+              </w:rPr>
+              <w:t xml:space="preserve">掛單時現貨價</w:t>
+            </w:r>
+          </w:p>
+        </w:tc>
+        <w:tc>
+          <w:tcPr>
+            <w:tcW w:type="dxa" w:w="1168"/>
+            <w:tcBorders>
+              <w:top w:val="single" w:color="9DB3C8" w:sz="4"/>
+              <w:left w:val="single" w:color="9DB3C8" w:sz="4"/>
+              <w:bottom w:val="single" w:color="9DB3C8" w:sz="4"/>
+              <w:right w:val="single" w:color="9DB3C8" w:sz="4"/>
+            </w:tcBorders>
+            <w:shd w:fill="1F3864" w:val="clear"/>
+            <w:tcMar>
+              <w:top w:type="dxa" w:w="80"/>
+              <w:left w:type="dxa" w:w="100"/>
+              <w:bottom w:type="dxa" w:w="80"/>
+              <w:right w:type="dxa" w:w="100"/>
+            </w:tcMar>
+            <w:vAlign w:val="center"/>
+          </w:tcPr>
+          <w:p>
+            <w:r>
+              <w:rPr>
+                <w:rFonts w:ascii="Microsoft JhengHei" w:cs="Microsoft JhengHei" w:eastAsia="Microsoft JhengHei" w:hAnsi="Microsoft JhengHei"/>
+                <w:b/>
+                <w:bCs/>
+                <w:color w:val="FFFFFF"/>
+                <w:sz w:val="19"/>
+                <w:szCs w:val="19"/>
+              </w:rPr>
+              <w:t xml:space="preserve">距轉換價之價外幅度</w:t>
+            </w:r>
+          </w:p>
+        </w:tc>
+        <w:tc>
+          <w:tcPr>
+            <w:tcW w:type="dxa" w:w="1168"/>
+            <w:tcBorders>
+              <w:top w:val="single" w:color="9DB3C8" w:sz="4"/>
+              <w:left w:val="single" w:color="9DB3C8" w:sz="4"/>
+              <w:bottom w:val="single" w:color="9DB3C8" w:sz="4"/>
+              <w:right w:val="single" w:color="9DB3C8" w:sz="4"/>
+            </w:tcBorders>
+            <w:shd w:fill="1F3864" w:val="clear"/>
+            <w:tcMar>
+              <w:top w:type="dxa" w:w="80"/>
+              <w:left w:type="dxa" w:w="100"/>
+              <w:bottom w:type="dxa" w:w="80"/>
+              <w:right w:type="dxa" w:w="100"/>
+            </w:tcMar>
+            <w:vAlign w:val="center"/>
+          </w:tcPr>
+          <w:p>
+            <w:r>
+              <w:rPr>
+                <w:rFonts w:ascii="Microsoft JhengHei" w:cs="Microsoft JhengHei" w:eastAsia="Microsoft JhengHei" w:hAnsi="Microsoft JhengHei"/>
+                <w:b/>
+                <w:bCs/>
+                <w:color w:val="FFFFFF"/>
+                <w:sz w:val="19"/>
+                <w:szCs w:val="19"/>
+              </w:rPr>
+              <w:t xml:space="preserve">示意年化</w:t>
+            </w:r>
+          </w:p>
+        </w:tc>
+        <w:tc>
+          <w:tcPr>
+            <w:tcW w:type="dxa" w:w="1168"/>
+            <w:tcBorders>
+              <w:top w:val="single" w:color="9DB3C8" w:sz="4"/>
+              <w:left w:val="single" w:color="9DB3C8" w:sz="4"/>
+              <w:bottom w:val="single" w:color="9DB3C8" w:sz="4"/>
+              <w:right w:val="single" w:color="9DB3C8" w:sz="4"/>
+            </w:tcBorders>
+            <w:shd w:fill="1F3864" w:val="clear"/>
+            <w:tcMar>
+              <w:top w:type="dxa" w:w="80"/>
+              <w:left w:type="dxa" w:w="100"/>
+              <w:bottom w:type="dxa" w:w="80"/>
+              <w:right w:type="dxa" w:w="100"/>
+            </w:tcMar>
+            <w:vAlign w:val="center"/>
+          </w:tcPr>
+          <w:p>
+            <w:r>
+              <w:rPr>
+                <w:rFonts w:ascii="Microsoft JhengHei" w:cs="Microsoft JhengHei" w:eastAsia="Microsoft JhengHei" w:hAnsi="Microsoft JhengHei"/>
+                <w:b/>
+                <w:bCs/>
+                <w:color w:val="FFFFFF"/>
+                <w:sz w:val="19"/>
+                <w:szCs w:val="19"/>
+              </w:rPr>
+              <w:t xml:space="preserve">本期權利金</w:t>
+            </w:r>
+          </w:p>
+        </w:tc>
+        <w:tc>
+          <w:tcPr>
+            <w:tcW w:type="dxa" w:w="1168"/>
+            <w:tcBorders>
+              <w:top w:val="single" w:color="9DB3C8" w:sz="4"/>
+              <w:left w:val="single" w:color="9DB3C8" w:sz="4"/>
+              <w:bottom w:val="single" w:color="9DB3C8" w:sz="4"/>
+              <w:right w:val="single" w:color="9DB3C8" w:sz="4"/>
+            </w:tcBorders>
+            <w:shd w:fill="1F3864" w:val="clear"/>
+            <w:tcMar>
+              <w:top w:type="dxa" w:w="80"/>
+              <w:left w:type="dxa" w:w="100"/>
+              <w:bottom w:type="dxa" w:w="80"/>
+              <w:right w:type="dxa" w:w="100"/>
+            </w:tcMar>
+            <w:vAlign w:val="center"/>
+          </w:tcPr>
+          <w:p>
+            <w:r>
+              <w:rPr>
+                <w:rFonts w:ascii="Microsoft JhengHei" w:cs="Microsoft JhengHei" w:eastAsia="Microsoft JhengHei" w:hAnsi="Microsoft JhengHei"/>
+                <w:b/>
+                <w:bCs/>
+                <w:color w:val="FFFFFF"/>
+                <w:sz w:val="19"/>
+                <w:szCs w:val="19"/>
+              </w:rPr>
+              <w:t xml:space="preserve">結算價</w:t>
+            </w:r>
+          </w:p>
+        </w:tc>
+        <w:tc>
+          <w:tcPr>
+            <w:tcW w:type="dxa" w:w="1174"/>
+            <w:tcBorders>
+              <w:top w:val="single" w:color="9DB3C8" w:sz="4"/>
+              <w:left w:val="single" w:color="9DB3C8" w:sz="4"/>
+              <w:bottom w:val="single" w:color="9DB3C8" w:sz="4"/>
+              <w:right w:val="single" w:color="9DB3C8" w:sz="4"/>
+            </w:tcBorders>
+            <w:shd w:fill="1F3864" w:val="clear"/>
+            <w:tcMar>
+              <w:top w:type="dxa" w:w="80"/>
+              <w:left w:type="dxa" w:w="100"/>
+              <w:bottom w:type="dxa" w:w="80"/>
+              <w:right w:type="dxa" w:w="100"/>
+            </w:tcMar>
+            <w:vAlign w:val="center"/>
+          </w:tcPr>
+          <w:p>
+            <w:r>
+              <w:rPr>
+                <w:rFonts w:ascii="Microsoft JhengHei" w:cs="Microsoft JhengHei" w:eastAsia="Microsoft JhengHei" w:hAnsi="Microsoft JhengHei"/>
+                <w:b/>
+                <w:bCs/>
+                <w:color w:val="FFFFFF"/>
+                <w:sz w:val="19"/>
+                <w:szCs w:val="19"/>
+              </w:rPr>
+              <w:t xml:space="preserve">結果</w:t>
+            </w:r>
+          </w:p>
+        </w:tc>
+      </w:tr>
+      <w:tr>
+        <w:tc>
+          <w:tcPr>
+            <w:tcW w:type="dxa" w:w="1168"/>
+            <w:tcBorders>
+              <w:top w:val="single" w:color="9DB3C8" w:sz="4"/>
+              <w:left w:val="single" w:color="9DB3C8" w:sz="4"/>
+              <w:bottom w:val="single" w:color="9DB3C8" w:sz="4"/>
+              <w:right w:val="single" w:color="9DB3C8" w:sz="4"/>
+            </w:tcBorders>
+            <w:tcMar>
+              <w:top w:type="dxa" w:w="80"/>
+              <w:left w:type="dxa" w:w="100"/>
+              <w:bottom w:type="dxa" w:w="80"/>
+              <w:right w:type="dxa" w:w="100"/>
+            </w:tcMar>
+            <w:vAlign w:val="center"/>
+          </w:tcPr>
+          <w:p>
+            <w:pPr>
+              <w:spacing w:line="264"/>
+            </w:pPr>
+            <w:r>
+              <w:rPr>
+                <w:rFonts w:ascii="Microsoft JhengHei" w:cs="Microsoft JhengHei" w:eastAsia="Microsoft JhengHei" w:hAnsi="Microsoft JhengHei"/>
+                <w:b/>
+                <w:bCs/>
+                <w:sz w:val="18"/>
+                <w:szCs w:val="18"/>
+              </w:rPr>
+              <w:t xml:space="preserve">第1週（低買）</w:t>
+            </w:r>
+          </w:p>
+        </w:tc>
+        <w:tc>
+          <w:tcPr>
+            <w:tcW w:type="dxa" w:w="1168"/>
+            <w:tcBorders>
+              <w:top w:val="single" w:color="9DB3C8" w:sz="4"/>
+              <w:left w:val="single" w:color="9DB3C8" w:sz="4"/>
+              <w:bottom w:val="single" w:color="9DB3C8" w:sz="4"/>
+              <w:right w:val="single" w:color="9DB3C8" w:sz="4"/>
+            </w:tcBorders>
+            <w:tcMar>
+              <w:top w:type="dxa" w:w="80"/>
+              <w:left w:type="dxa" w:w="100"/>
+              <w:bottom w:type="dxa" w:w="80"/>
+              <w:right w:type="dxa" w:w="100"/>
+            </w:tcMar>
+            <w:vAlign w:val="center"/>
+          </w:tcPr>
+          <w:p>
+            <w:pPr>
+              <w:spacing w:line="264"/>
+            </w:pPr>
+            <w:r>
+              <w:rPr>
+                <w:rFonts w:ascii="Microsoft JhengHei" w:cs="Microsoft JhengHei" w:eastAsia="Microsoft JhengHei" w:hAnsi="Microsoft JhengHei"/>
+                <w:sz w:val="18"/>
+                <w:szCs w:val="18"/>
+              </w:rPr>
+              <w:t xml:space="preserve">以 $1,000,000 USDT 申購「低買」，行使價 $55,900</w:t>
+            </w:r>
+          </w:p>
+        </w:tc>
+        <w:tc>
+          <w:tcPr>
+            <w:tcW w:type="dxa" w:w="1168"/>
+            <w:tcBorders>
+              <w:top w:val="single" w:color="9DB3C8" w:sz="4"/>
+              <w:left w:val="single" w:color="9DB3C8" w:sz="4"/>
+              <w:bottom w:val="single" w:color="9DB3C8" w:sz="4"/>
+              <w:right w:val="single" w:color="9DB3C8" w:sz="4"/>
+            </w:tcBorders>
+            <w:tcMar>
+              <w:top w:type="dxa" w:w="80"/>
+              <w:left w:type="dxa" w:w="100"/>
+              <w:bottom w:type="dxa" w:w="80"/>
+              <w:right w:type="dxa" w:w="100"/>
+            </w:tcMar>
+            <w:vAlign w:val="center"/>
+          </w:tcPr>
+          <w:p>
+            <w:pPr>
+              <w:spacing w:line="264"/>
+            </w:pPr>
+            <w:r>
+              <w:rPr>
+                <w:rFonts w:ascii="Microsoft JhengHei" w:cs="Microsoft JhengHei" w:eastAsia="Microsoft JhengHei" w:hAnsi="Microsoft JhengHei"/>
+                <w:sz w:val="18"/>
+                <w:szCs w:val="18"/>
+              </w:rPr>
+              <w:t xml:space="preserve">$58,000</w:t>
+            </w:r>
+          </w:p>
+        </w:tc>
+        <w:tc>
+          <w:tcPr>
+            <w:tcW w:type="dxa" w:w="1168"/>
+            <w:tcBorders>
+              <w:top w:val="single" w:color="9DB3C8" w:sz="4"/>
+              <w:left w:val="single" w:color="9DB3C8" w:sz="4"/>
+              <w:bottom w:val="single" w:color="9DB3C8" w:sz="4"/>
+              <w:right w:val="single" w:color="9DB3C8" w:sz="4"/>
+            </w:tcBorders>
+            <w:tcMar>
+              <w:top w:type="dxa" w:w="80"/>
+              <w:left w:type="dxa" w:w="100"/>
+              <w:bottom w:type="dxa" w:w="80"/>
+              <w:right w:type="dxa" w:w="100"/>
+            </w:tcMar>
+            <w:vAlign w:val="center"/>
+          </w:tcPr>
+          <w:p>
+            <w:pPr>
+              <w:spacing w:line="264"/>
+            </w:pPr>
+            <w:r>
+              <w:rPr>
+                <w:rFonts w:ascii="Microsoft JhengHei" w:cs="Microsoft JhengHei" w:eastAsia="Microsoft JhengHei" w:hAnsi="Microsoft JhengHei"/>
+                <w:sz w:val="18"/>
+                <w:szCs w:val="18"/>
+              </w:rPr>
+              <w:t xml:space="preserve">—</w:t>
+            </w:r>
+          </w:p>
+        </w:tc>
+        <w:tc>
+          <w:tcPr>
+            <w:tcW w:type="dxa" w:w="1168"/>
+            <w:tcBorders>
+              <w:top w:val="single" w:color="9DB3C8" w:sz="4"/>
+              <w:left w:val="single" w:color="9DB3C8" w:sz="4"/>
+              <w:bottom w:val="single" w:color="9DB3C8" w:sz="4"/>
+              <w:right w:val="single" w:color="9DB3C8" w:sz="4"/>
+            </w:tcBorders>
+            <w:tcMar>
+              <w:top w:type="dxa" w:w="80"/>
+              <w:left w:type="dxa" w:w="100"/>
+              <w:bottom w:type="dxa" w:w="80"/>
+              <w:right w:type="dxa" w:w="100"/>
+            </w:tcMar>
+            <w:vAlign w:val="center"/>
+          </w:tcPr>
+          <w:p>
+            <w:pPr>
+              <w:spacing w:line="264"/>
+            </w:pPr>
+            <w:r>
+              <w:rPr>
+                <w:rFonts w:ascii="Microsoft JhengHei" w:cs="Microsoft JhengHei" w:eastAsia="Microsoft JhengHei" w:hAnsi="Microsoft JhengHei"/>
+                <w:sz w:val="18"/>
+                <w:szCs w:val="18"/>
+              </w:rPr>
+              <w:t xml:space="preserve">40%</w:t>
+            </w:r>
+          </w:p>
+        </w:tc>
+        <w:tc>
+          <w:tcPr>
+            <w:tcW w:type="dxa" w:w="1168"/>
+            <w:tcBorders>
+              <w:top w:val="single" w:color="9DB3C8" w:sz="4"/>
+              <w:left w:val="single" w:color="9DB3C8" w:sz="4"/>
+              <w:bottom w:val="single" w:color="9DB3C8" w:sz="4"/>
+              <w:right w:val="single" w:color="9DB3C8" w:sz="4"/>
+            </w:tcBorders>
+            <w:tcMar>
+              <w:top w:type="dxa" w:w="80"/>
+              <w:left w:type="dxa" w:w="100"/>
+              <w:bottom w:type="dxa" w:w="80"/>
+              <w:right w:type="dxa" w:w="100"/>
+            </w:tcMar>
+            <w:vAlign w:val="center"/>
+          </w:tcPr>
+          <w:p>
+            <w:pPr>
+              <w:spacing w:line="264"/>
+            </w:pPr>
+            <w:r>
+              <w:rPr>
+                <w:rFonts w:ascii="Microsoft JhengHei" w:cs="Microsoft JhengHei" w:eastAsia="Microsoft JhengHei" w:hAnsi="Microsoft JhengHei"/>
+                <w:sz w:val="18"/>
+                <w:szCs w:val="18"/>
+              </w:rPr>
+              <w:t xml:space="preserve">$7,671.23</w:t>
+            </w:r>
+          </w:p>
+        </w:tc>
+        <w:tc>
+          <w:tcPr>
+            <w:tcW w:type="dxa" w:w="1168"/>
+            <w:tcBorders>
+              <w:top w:val="single" w:color="9DB3C8" w:sz="4"/>
+              <w:left w:val="single" w:color="9DB3C8" w:sz="4"/>
+              <w:bottom w:val="single" w:color="9DB3C8" w:sz="4"/>
+              <w:right w:val="single" w:color="9DB3C8" w:sz="4"/>
+            </w:tcBorders>
+            <w:tcMar>
+              <w:top w:type="dxa" w:w="80"/>
+              <w:left w:type="dxa" w:w="100"/>
+              <w:bottom w:type="dxa" w:w="80"/>
+              <w:right w:type="dxa" w:w="100"/>
+            </w:tcMar>
+            <w:vAlign w:val="center"/>
+          </w:tcPr>
+          <w:p>
+            <w:pPr>
+              <w:spacing w:line="264"/>
+            </w:pPr>
+            <w:r>
+              <w:rPr>
+                <w:rFonts w:ascii="Microsoft JhengHei" w:cs="Microsoft JhengHei" w:eastAsia="Microsoft JhengHei" w:hAnsi="Microsoft JhengHei"/>
+                <w:sz w:val="18"/>
+                <w:szCs w:val="18"/>
+              </w:rPr>
+              <w:t xml:space="preserve">$53,000（跌破）</w:t>
+            </w:r>
+          </w:p>
+        </w:tc>
+        <w:tc>
+          <w:tcPr>
+            <w:tcW w:type="dxa" w:w="1174"/>
+            <w:tcBorders>
+              <w:top w:val="single" w:color="9DB3C8" w:sz="4"/>
+              <w:left w:val="single" w:color="9DB3C8" w:sz="4"/>
+              <w:bottom w:val="single" w:color="9DB3C8" w:sz="4"/>
+              <w:right w:val="single" w:color="9DB3C8" w:sz="4"/>
+            </w:tcBorders>
+            <w:tcMar>
+              <w:top w:type="dxa" w:w="80"/>
+              <w:left w:type="dxa" w:w="100"/>
+              <w:bottom w:type="dxa" w:w="80"/>
+              <w:right w:type="dxa" w:w="100"/>
+            </w:tcMar>
+            <w:vAlign w:val="center"/>
+          </w:tcPr>
+          <w:p>
+            <w:pPr>
+              <w:spacing w:line="264"/>
+            </w:pPr>
+            <w:r>
+              <w:rPr>
+                <w:rFonts w:ascii="Microsoft JhengHei" w:cs="Microsoft JhengHei" w:eastAsia="Microsoft JhengHei" w:hAnsi="Microsoft JhengHei"/>
+                <w:sz w:val="18"/>
+                <w:szCs w:val="18"/>
+              </w:rPr>
+              <w:t xml:space="preserve">強制轉換為 </w:t>
+            </w:r>
+            <w:r>
+              <w:rPr>
+                <w:rFonts w:ascii="Microsoft JhengHei" w:cs="Microsoft JhengHei" w:eastAsia="Microsoft JhengHei" w:hAnsi="Microsoft JhengHei"/>
+                <w:b/>
+                <w:bCs/>
+                <w:sz w:val="18"/>
+                <w:szCs w:val="18"/>
+              </w:rPr>
+              <w:t xml:space="preserve">17.8891 BTC</w:t>
+            </w:r>
+            <w:r>
+              <w:rPr>
+                <w:rFonts w:ascii="Microsoft JhengHei" w:cs="Microsoft JhengHei" w:eastAsia="Microsoft JhengHei" w:hAnsi="Microsoft JhengHei"/>
+                <w:sz w:val="18"/>
+                <w:szCs w:val="18"/>
+              </w:rPr>
+              <w:t xml:space="preserve">（=1,000,000÷55,900）</w:t>
+            </w:r>
+          </w:p>
+        </w:tc>
+      </w:tr>
+      <w:tr>
+        <w:tc>
+          <w:tcPr>
+            <w:tcW w:type="dxa" w:w="1168"/>
+            <w:tcBorders>
+              <w:top w:val="single" w:color="9DB3C8" w:sz="4"/>
+              <w:left w:val="single" w:color="9DB3C8" w:sz="4"/>
+              <w:bottom w:val="single" w:color="9DB3C8" w:sz="4"/>
+              <w:right w:val="single" w:color="9DB3C8" w:sz="4"/>
+            </w:tcBorders>
+            <w:tcMar>
+              <w:top w:type="dxa" w:w="80"/>
+              <w:left w:type="dxa" w:w="100"/>
+              <w:bottom w:type="dxa" w:w="80"/>
+              <w:right w:type="dxa" w:w="100"/>
+            </w:tcMar>
+            <w:vAlign w:val="center"/>
+          </w:tcPr>
+          <w:p>
+            <w:pPr>
+              <w:spacing w:line="264"/>
+            </w:pPr>
+            <w:r>
+              <w:rPr>
+                <w:rFonts w:ascii="Microsoft JhengHei" w:cs="Microsoft JhengHei" w:eastAsia="Microsoft JhengHei" w:hAnsi="Microsoft JhengHei"/>
+                <w:b/>
+                <w:bCs/>
+                <w:sz w:val="18"/>
+                <w:szCs w:val="18"/>
+              </w:rPr>
+              <w:t xml:space="preserve">第2週（高賣，滾動）</w:t>
+            </w:r>
+          </w:p>
+        </w:tc>
+        <w:tc>
+          <w:tcPr>
+            <w:tcW w:type="dxa" w:w="1168"/>
+            <w:tcBorders>
+              <w:top w:val="single" w:color="9DB3C8" w:sz="4"/>
+              <w:left w:val="single" w:color="9DB3C8" w:sz="4"/>
+              <w:bottom w:val="single" w:color="9DB3C8" w:sz="4"/>
+              <w:right w:val="single" w:color="9DB3C8" w:sz="4"/>
+            </w:tcBorders>
+            <w:tcMar>
+              <w:top w:type="dxa" w:w="80"/>
+              <w:left w:type="dxa" w:w="100"/>
+              <w:bottom w:type="dxa" w:w="80"/>
+              <w:right w:type="dxa" w:w="100"/>
+            </w:tcMar>
+            <w:vAlign w:val="center"/>
+          </w:tcPr>
+          <w:p>
+            <w:pPr>
+              <w:spacing w:line="264"/>
+            </w:pPr>
+            <w:r>
+              <w:rPr>
+                <w:rFonts w:ascii="Microsoft JhengHei" w:cs="Microsoft JhengHei" w:eastAsia="Microsoft JhengHei" w:hAnsi="Microsoft JhengHei"/>
+                <w:sz w:val="18"/>
+                <w:szCs w:val="18"/>
+              </w:rPr>
+              <w:t xml:space="preserve">以持有之 17.8891 BTC 申購「高賣」，行使價</w:t>
+            </w:r>
+            <w:r>
+              <w:rPr>
+                <w:rFonts w:ascii="Microsoft JhengHei" w:cs="Microsoft JhengHei" w:eastAsia="Microsoft JhengHei" w:hAnsi="Microsoft JhengHei"/>
+                <w:b/>
+                <w:bCs/>
+                <w:sz w:val="18"/>
+                <w:szCs w:val="18"/>
+              </w:rPr>
+              <w:t xml:space="preserve">維持</w:t>
+            </w:r>
+            <w:r>
+              <w:rPr>
+                <w:rFonts w:ascii="Microsoft JhengHei" w:cs="Microsoft JhengHei" w:eastAsia="Microsoft JhengHei" w:hAnsi="Microsoft JhengHei"/>
+                <w:sz w:val="18"/>
+                <w:szCs w:val="18"/>
+              </w:rPr>
+              <w:t xml:space="preserve"> $55,900</w:t>
+            </w:r>
+          </w:p>
+        </w:tc>
+        <w:tc>
+          <w:tcPr>
+            <w:tcW w:type="dxa" w:w="1168"/>
+            <w:tcBorders>
+              <w:top w:val="single" w:color="9DB3C8" w:sz="4"/>
+              <w:left w:val="single" w:color="9DB3C8" w:sz="4"/>
+              <w:bottom w:val="single" w:color="9DB3C8" w:sz="4"/>
+              <w:right w:val="single" w:color="9DB3C8" w:sz="4"/>
+            </w:tcBorders>
+            <w:tcMar>
+              <w:top w:type="dxa" w:w="80"/>
+              <w:left w:type="dxa" w:w="100"/>
+              <w:bottom w:type="dxa" w:w="80"/>
+              <w:right w:type="dxa" w:w="100"/>
+            </w:tcMar>
+            <w:vAlign w:val="center"/>
+          </w:tcPr>
+          <w:p>
+            <w:pPr>
+              <w:spacing w:line="264"/>
+            </w:pPr>
+            <w:r>
+              <w:rPr>
+                <w:rFonts w:ascii="Microsoft JhengHei" w:cs="Microsoft JhengHei" w:eastAsia="Microsoft JhengHei" w:hAnsi="Microsoft JhengHei"/>
+                <w:sz w:val="18"/>
+                <w:szCs w:val="18"/>
+              </w:rPr>
+              <w:t xml:space="preserve">$53,000</w:t>
+            </w:r>
+          </w:p>
+        </w:tc>
+        <w:tc>
+          <w:tcPr>
+            <w:tcW w:type="dxa" w:w="1168"/>
+            <w:tcBorders>
+              <w:top w:val="single" w:color="9DB3C8" w:sz="4"/>
+              <w:left w:val="single" w:color="9DB3C8" w:sz="4"/>
+              <w:bottom w:val="single" w:color="9DB3C8" w:sz="4"/>
+              <w:right w:val="single" w:color="9DB3C8" w:sz="4"/>
+            </w:tcBorders>
+            <w:tcMar>
+              <w:top w:type="dxa" w:w="80"/>
+              <w:left w:type="dxa" w:w="100"/>
+              <w:bottom w:type="dxa" w:w="80"/>
+              <w:right w:type="dxa" w:w="100"/>
+            </w:tcMar>
+            <w:vAlign w:val="center"/>
+          </w:tcPr>
+          <w:p>
+            <w:pPr>
+              <w:spacing w:line="264"/>
+            </w:pPr>
+            <w:r>
+              <w:rPr>
+                <w:rFonts w:ascii="Microsoft JhengHei" w:cs="Microsoft JhengHei" w:eastAsia="Microsoft JhengHei" w:hAnsi="Microsoft JhengHei"/>
+                <w:sz w:val="18"/>
+                <w:szCs w:val="18"/>
+              </w:rPr>
+              <w:t xml:space="preserve">5.5%（價外）</w:t>
+            </w:r>
+          </w:p>
+        </w:tc>
+        <w:tc>
+          <w:tcPr>
+            <w:tcW w:type="dxa" w:w="1168"/>
+            <w:tcBorders>
+              <w:top w:val="single" w:color="9DB3C8" w:sz="4"/>
+              <w:left w:val="single" w:color="9DB3C8" w:sz="4"/>
+              <w:bottom w:val="single" w:color="9DB3C8" w:sz="4"/>
+              <w:right w:val="single" w:color="9DB3C8" w:sz="4"/>
+            </w:tcBorders>
+            <w:tcMar>
+              <w:top w:type="dxa" w:w="80"/>
+              <w:left w:type="dxa" w:w="100"/>
+              <w:bottom w:type="dxa" w:w="80"/>
+              <w:right w:type="dxa" w:w="100"/>
+            </w:tcMar>
+            <w:vAlign w:val="center"/>
+          </w:tcPr>
+          <w:p>
+            <w:pPr>
+              <w:spacing w:line="264"/>
+            </w:pPr>
+            <w:r>
+              <w:rPr>
+                <w:rFonts w:ascii="Microsoft JhengHei" w:cs="Microsoft JhengHei" w:eastAsia="Microsoft JhengHei" w:hAnsi="Microsoft JhengHei"/>
+                <w:sz w:val="18"/>
+                <w:szCs w:val="18"/>
+              </w:rPr>
+              <w:t xml:space="preserve">32%＊</w:t>
+            </w:r>
+          </w:p>
+        </w:tc>
+        <w:tc>
+          <w:tcPr>
+            <w:tcW w:type="dxa" w:w="1168"/>
+            <w:tcBorders>
+              <w:top w:val="single" w:color="9DB3C8" w:sz="4"/>
+              <w:left w:val="single" w:color="9DB3C8" w:sz="4"/>
+              <w:bottom w:val="single" w:color="9DB3C8" w:sz="4"/>
+              <w:right w:val="single" w:color="9DB3C8" w:sz="4"/>
+            </w:tcBorders>
+            <w:tcMar>
+              <w:top w:type="dxa" w:w="80"/>
+              <w:left w:type="dxa" w:w="100"/>
+              <w:bottom w:type="dxa" w:w="80"/>
+              <w:right w:type="dxa" w:w="100"/>
+            </w:tcMar>
+            <w:vAlign w:val="center"/>
+          </w:tcPr>
+          <w:p>
+            <w:pPr>
+              <w:spacing w:line="264"/>
+            </w:pPr>
+            <w:r>
+              <w:rPr>
+                <w:rFonts w:ascii="Microsoft JhengHei" w:cs="Microsoft JhengHei" w:eastAsia="Microsoft JhengHei" w:hAnsi="Microsoft JhengHei"/>
+                <w:sz w:val="18"/>
+                <w:szCs w:val="18"/>
+              </w:rPr>
+              <w:t xml:space="preserve">$5,822.71</w:t>
+            </w:r>
+          </w:p>
+        </w:tc>
+        <w:tc>
+          <w:tcPr>
+            <w:tcW w:type="dxa" w:w="1168"/>
+            <w:tcBorders>
+              <w:top w:val="single" w:color="9DB3C8" w:sz="4"/>
+              <w:left w:val="single" w:color="9DB3C8" w:sz="4"/>
+              <w:bottom w:val="single" w:color="9DB3C8" w:sz="4"/>
+              <w:right w:val="single" w:color="9DB3C8" w:sz="4"/>
+            </w:tcBorders>
+            <w:tcMar>
+              <w:top w:type="dxa" w:w="80"/>
+              <w:left w:type="dxa" w:w="100"/>
+              <w:bottom w:type="dxa" w:w="80"/>
+              <w:right w:type="dxa" w:w="100"/>
+            </w:tcMar>
+            <w:vAlign w:val="center"/>
+          </w:tcPr>
+          <w:p>
+            <w:pPr>
+              <w:spacing w:line="264"/>
+            </w:pPr>
+            <w:r>
+              <w:rPr>
+                <w:rFonts w:ascii="Microsoft JhengHei" w:cs="Microsoft JhengHei" w:eastAsia="Microsoft JhengHei" w:hAnsi="Microsoft JhengHei"/>
+                <w:sz w:val="18"/>
+                <w:szCs w:val="18"/>
+              </w:rPr>
+              <w:t xml:space="preserve">$54,000（未漲破）</w:t>
+            </w:r>
+          </w:p>
+        </w:tc>
+        <w:tc>
+          <w:tcPr>
+            <w:tcW w:type="dxa" w:w="1174"/>
+            <w:tcBorders>
+              <w:top w:val="single" w:color="9DB3C8" w:sz="4"/>
+              <w:left w:val="single" w:color="9DB3C8" w:sz="4"/>
+              <w:bottom w:val="single" w:color="9DB3C8" w:sz="4"/>
+              <w:right w:val="single" w:color="9DB3C8" w:sz="4"/>
+            </w:tcBorders>
+            <w:tcMar>
+              <w:top w:type="dxa" w:w="80"/>
+              <w:left w:type="dxa" w:w="100"/>
+              <w:bottom w:type="dxa" w:w="80"/>
+              <w:right w:type="dxa" w:w="100"/>
+            </w:tcMar>
+            <w:vAlign w:val="center"/>
+          </w:tcPr>
+          <w:p>
+            <w:pPr>
+              <w:spacing w:line="264"/>
+            </w:pPr>
+            <w:r>
+              <w:rPr>
+                <w:rFonts w:ascii="Microsoft JhengHei" w:cs="Microsoft JhengHei" w:eastAsia="Microsoft JhengHei" w:hAnsi="Microsoft JhengHei"/>
+                <w:sz w:val="18"/>
+                <w:szCs w:val="18"/>
+              </w:rPr>
+              <w:t xml:space="preserve">未履約，續留 17.8891 BTC</w:t>
+            </w:r>
+          </w:p>
+        </w:tc>
+      </w:tr>
+      <w:tr>
+        <w:tc>
+          <w:tcPr>
+            <w:tcW w:type="dxa" w:w="1168"/>
+            <w:tcBorders>
+              <w:top w:val="single" w:color="9DB3C8" w:sz="4"/>
+              <w:left w:val="single" w:color="9DB3C8" w:sz="4"/>
+              <w:bottom w:val="single" w:color="9DB3C8" w:sz="4"/>
+              <w:right w:val="single" w:color="9DB3C8" w:sz="4"/>
+            </w:tcBorders>
+            <w:tcMar>
+              <w:top w:type="dxa" w:w="80"/>
+              <w:left w:type="dxa" w:w="100"/>
+              <w:bottom w:type="dxa" w:w="80"/>
+              <w:right w:type="dxa" w:w="100"/>
+            </w:tcMar>
+            <w:vAlign w:val="center"/>
+          </w:tcPr>
+          <w:p>
+            <w:pPr>
+              <w:spacing w:line="264"/>
+            </w:pPr>
+            <w:r>
+              <w:rPr>
+                <w:rFonts w:ascii="Microsoft JhengHei" w:cs="Microsoft JhengHei" w:eastAsia="Microsoft JhengHei" w:hAnsi="Microsoft JhengHei"/>
+                <w:b/>
+                <w:bCs/>
+                <w:sz w:val="18"/>
+                <w:szCs w:val="18"/>
+              </w:rPr>
+              <w:t xml:space="preserve">第3週（高賣，滾動）</w:t>
+            </w:r>
+          </w:p>
+        </w:tc>
+        <w:tc>
+          <w:tcPr>
+            <w:tcW w:type="dxa" w:w="1168"/>
+            <w:tcBorders>
+              <w:top w:val="single" w:color="9DB3C8" w:sz="4"/>
+              <w:left w:val="single" w:color="9DB3C8" w:sz="4"/>
+              <w:bottom w:val="single" w:color="9DB3C8" w:sz="4"/>
+              <w:right w:val="single" w:color="9DB3C8" w:sz="4"/>
+            </w:tcBorders>
+            <w:tcMar>
+              <w:top w:type="dxa" w:w="80"/>
+              <w:left w:type="dxa" w:w="100"/>
+              <w:bottom w:type="dxa" w:w="80"/>
+              <w:right w:type="dxa" w:w="100"/>
+            </w:tcMar>
+            <w:vAlign w:val="center"/>
+          </w:tcPr>
+          <w:p>
+            <w:pPr>
+              <w:spacing w:line="264"/>
+            </w:pPr>
+            <w:r>
+              <w:rPr>
+                <w:rFonts w:ascii="Microsoft JhengHei" w:cs="Microsoft JhengHei" w:eastAsia="Microsoft JhengHei" w:hAnsi="Microsoft JhengHei"/>
+                <w:sz w:val="18"/>
+                <w:szCs w:val="18"/>
+              </w:rPr>
+              <w:t xml:space="preserve">以持有之 17.8891 BTC 申購「高賣」，行使價</w:t>
+            </w:r>
+            <w:r>
+              <w:rPr>
+                <w:rFonts w:ascii="Microsoft JhengHei" w:cs="Microsoft JhengHei" w:eastAsia="Microsoft JhengHei" w:hAnsi="Microsoft JhengHei"/>
+                <w:b/>
+                <w:bCs/>
+                <w:sz w:val="18"/>
+                <w:szCs w:val="18"/>
+              </w:rPr>
+              <w:t xml:space="preserve">維持</w:t>
+            </w:r>
+            <w:r>
+              <w:rPr>
+                <w:rFonts w:ascii="Microsoft JhengHei" w:cs="Microsoft JhengHei" w:eastAsia="Microsoft JhengHei" w:hAnsi="Microsoft JhengHei"/>
+                <w:sz w:val="18"/>
+                <w:szCs w:val="18"/>
+              </w:rPr>
+              <w:t xml:space="preserve"> $55,900</w:t>
+            </w:r>
+          </w:p>
+        </w:tc>
+        <w:tc>
+          <w:tcPr>
+            <w:tcW w:type="dxa" w:w="1168"/>
+            <w:tcBorders>
+              <w:top w:val="single" w:color="9DB3C8" w:sz="4"/>
+              <w:left w:val="single" w:color="9DB3C8" w:sz="4"/>
+              <w:bottom w:val="single" w:color="9DB3C8" w:sz="4"/>
+              <w:right w:val="single" w:color="9DB3C8" w:sz="4"/>
+            </w:tcBorders>
+            <w:tcMar>
+              <w:top w:type="dxa" w:w="80"/>
+              <w:left w:type="dxa" w:w="100"/>
+              <w:bottom w:type="dxa" w:w="80"/>
+              <w:right w:type="dxa" w:w="100"/>
+            </w:tcMar>
+            <w:vAlign w:val="center"/>
+          </w:tcPr>
+          <w:p>
+            <w:pPr>
+              <w:spacing w:line="264"/>
+            </w:pPr>
+            <w:r>
+              <w:rPr>
+                <w:rFonts w:ascii="Microsoft JhengHei" w:cs="Microsoft JhengHei" w:eastAsia="Microsoft JhengHei" w:hAnsi="Microsoft JhengHei"/>
+                <w:sz w:val="18"/>
+                <w:szCs w:val="18"/>
+              </w:rPr>
+              <w:t xml:space="preserve">$54,000</w:t>
+            </w:r>
+          </w:p>
+        </w:tc>
+        <w:tc>
+          <w:tcPr>
+            <w:tcW w:type="dxa" w:w="1168"/>
+            <w:tcBorders>
+              <w:top w:val="single" w:color="9DB3C8" w:sz="4"/>
+              <w:left w:val="single" w:color="9DB3C8" w:sz="4"/>
+              <w:bottom w:val="single" w:color="9DB3C8" w:sz="4"/>
+              <w:right w:val="single" w:color="9DB3C8" w:sz="4"/>
+            </w:tcBorders>
+            <w:tcMar>
+              <w:top w:type="dxa" w:w="80"/>
+              <w:left w:type="dxa" w:w="100"/>
+              <w:bottom w:type="dxa" w:w="80"/>
+              <w:right w:type="dxa" w:w="100"/>
+            </w:tcMar>
+            <w:vAlign w:val="center"/>
+          </w:tcPr>
+          <w:p>
+            <w:pPr>
+              <w:spacing w:line="264"/>
+            </w:pPr>
+            <w:r>
+              <w:rPr>
+                <w:rFonts w:ascii="Microsoft JhengHei" w:cs="Microsoft JhengHei" w:eastAsia="Microsoft JhengHei" w:hAnsi="Microsoft JhengHei"/>
+                <w:sz w:val="18"/>
+                <w:szCs w:val="18"/>
+              </w:rPr>
+              <w:t xml:space="preserve">3.5%（價外）</w:t>
+            </w:r>
+          </w:p>
+        </w:tc>
+        <w:tc>
+          <w:tcPr>
+            <w:tcW w:type="dxa" w:w="1168"/>
+            <w:tcBorders>
+              <w:top w:val="single" w:color="9DB3C8" w:sz="4"/>
+              <w:left w:val="single" w:color="9DB3C8" w:sz="4"/>
+              <w:bottom w:val="single" w:color="9DB3C8" w:sz="4"/>
+              <w:right w:val="single" w:color="9DB3C8" w:sz="4"/>
+            </w:tcBorders>
+            <w:tcMar>
+              <w:top w:type="dxa" w:w="80"/>
+              <w:left w:type="dxa" w:w="100"/>
+              <w:bottom w:type="dxa" w:w="80"/>
+              <w:right w:type="dxa" w:w="100"/>
+            </w:tcMar>
+            <w:vAlign w:val="center"/>
+          </w:tcPr>
+          <w:p>
+            <w:pPr>
+              <w:spacing w:line="264"/>
+            </w:pPr>
+            <w:r>
+              <w:rPr>
+                <w:rFonts w:ascii="Microsoft JhengHei" w:cs="Microsoft JhengHei" w:eastAsia="Microsoft JhengHei" w:hAnsi="Microsoft JhengHei"/>
+                <w:sz w:val="18"/>
+                <w:szCs w:val="18"/>
+              </w:rPr>
+              <w:t xml:space="preserve">38%＊</w:t>
+            </w:r>
+          </w:p>
+        </w:tc>
+        <w:tc>
+          <w:tcPr>
+            <w:tcW w:type="dxa" w:w="1168"/>
+            <w:tcBorders>
+              <w:top w:val="single" w:color="9DB3C8" w:sz="4"/>
+              <w:left w:val="single" w:color="9DB3C8" w:sz="4"/>
+              <w:bottom w:val="single" w:color="9DB3C8" w:sz="4"/>
+              <w:right w:val="single" w:color="9DB3C8" w:sz="4"/>
+            </w:tcBorders>
+            <w:tcMar>
+              <w:top w:type="dxa" w:w="80"/>
+              <w:left w:type="dxa" w:w="100"/>
+              <w:bottom w:type="dxa" w:w="80"/>
+              <w:right w:type="dxa" w:w="100"/>
+            </w:tcMar>
+            <w:vAlign w:val="center"/>
+          </w:tcPr>
+          <w:p>
+            <w:pPr>
+              <w:spacing w:line="264"/>
+            </w:pPr>
+            <w:r>
+              <w:rPr>
+                <w:rFonts w:ascii="Microsoft JhengHei" w:cs="Microsoft JhengHei" w:eastAsia="Microsoft JhengHei" w:hAnsi="Microsoft JhengHei"/>
+                <w:sz w:val="18"/>
+                <w:szCs w:val="18"/>
+              </w:rPr>
+              <w:t xml:space="preserve">$7,041.53</w:t>
+            </w:r>
+          </w:p>
+        </w:tc>
+        <w:tc>
+          <w:tcPr>
+            <w:tcW w:type="dxa" w:w="1168"/>
+            <w:tcBorders>
+              <w:top w:val="single" w:color="9DB3C8" w:sz="4"/>
+              <w:left w:val="single" w:color="9DB3C8" w:sz="4"/>
+              <w:bottom w:val="single" w:color="9DB3C8" w:sz="4"/>
+              <w:right w:val="single" w:color="9DB3C8" w:sz="4"/>
+            </w:tcBorders>
+            <w:tcMar>
+              <w:top w:type="dxa" w:w="80"/>
+              <w:left w:type="dxa" w:w="100"/>
+              <w:bottom w:type="dxa" w:w="80"/>
+              <w:right w:type="dxa" w:w="100"/>
+            </w:tcMar>
+            <w:vAlign w:val="center"/>
+          </w:tcPr>
+          <w:p>
+            <w:pPr>
+              <w:spacing w:line="264"/>
+            </w:pPr>
+            <w:r>
+              <w:rPr>
+                <w:rFonts w:ascii="Microsoft JhengHei" w:cs="Microsoft JhengHei" w:eastAsia="Microsoft JhengHei" w:hAnsi="Microsoft JhengHei"/>
+                <w:sz w:val="18"/>
+                <w:szCs w:val="18"/>
+              </w:rPr>
+              <w:t xml:space="preserve">$56,500（漲破）</w:t>
+            </w:r>
+          </w:p>
+        </w:tc>
+        <w:tc>
+          <w:tcPr>
+            <w:tcW w:type="dxa" w:w="1174"/>
+            <w:tcBorders>
+              <w:top w:val="single" w:color="9DB3C8" w:sz="4"/>
+              <w:left w:val="single" w:color="9DB3C8" w:sz="4"/>
+              <w:bottom w:val="single" w:color="9DB3C8" w:sz="4"/>
+              <w:right w:val="single" w:color="9DB3C8" w:sz="4"/>
+            </w:tcBorders>
+            <w:tcMar>
+              <w:top w:type="dxa" w:w="80"/>
+              <w:left w:type="dxa" w:w="100"/>
+              <w:bottom w:type="dxa" w:w="80"/>
+              <w:right w:type="dxa" w:w="100"/>
+            </w:tcMar>
+            <w:vAlign w:val="center"/>
+          </w:tcPr>
+          <w:p>
+            <w:pPr>
+              <w:spacing w:line="264"/>
+            </w:pPr>
+            <w:r>
+              <w:rPr>
+                <w:rFonts w:ascii="Microsoft JhengHei" w:cs="Microsoft JhengHei" w:eastAsia="Microsoft JhengHei" w:hAnsi="Microsoft JhengHei"/>
+                <w:sz w:val="18"/>
+                <w:szCs w:val="18"/>
+              </w:rPr>
+              <w:t xml:space="preserve">履約，依 $55,900 換回 </w:t>
+            </w:r>
+            <w:r>
+              <w:rPr>
+                <w:rFonts w:ascii="Microsoft JhengHei" w:cs="Microsoft JhengHei" w:eastAsia="Microsoft JhengHei" w:hAnsi="Microsoft JhengHei"/>
+                <w:b/>
+                <w:bCs/>
+                <w:sz w:val="18"/>
+                <w:szCs w:val="18"/>
+              </w:rPr>
+              <w:t xml:space="preserve">$1,000,000.00</w:t>
+            </w:r>
+            <w:r>
+              <w:rPr>
+                <w:rFonts w:ascii="Microsoft JhengHei" w:cs="Microsoft JhengHei" w:eastAsia="Microsoft JhengHei" w:hAnsi="Microsoft JhengHei"/>
+                <w:sz w:val="18"/>
+                <w:szCs w:val="18"/>
+              </w:rPr>
+              <w:t xml:space="preserve"> USDT</w:t>
+            </w:r>
+          </w:p>
+        </w:tc>
+      </w:tr>
+    </w:tbl>
+    <w:p>
+      <w:pPr>
+        <w:spacing w:after="160"/>
+      </w:pPr>
     </w:p>
     <w:p>
       <w:pPr>
@@ -7484,8 +8736,13 @@
           <w:sz w:val="21"/>
           <w:szCs w:val="21"/>
         </w:rPr>
-        <w:t xml:space="preserve">2. </w:t>
-      </w:r>
+        <w:t xml:space="preserve">＊示意年化隨「現貨價與固定行使價之乖離幅度」變動——此為 6.4.2 節之核心限制，詳見下方說明。</w:t>
+      </w:r>
+    </w:p>
+    <w:p>
+      <w:pPr>
+        <w:spacing w:after="160" w:line="300"/>
+      </w:pPr>
       <w:r>
         <w:rPr>
           <w:rFonts w:ascii="Microsoft JhengHei" w:cs="Microsoft JhengHei" w:eastAsia="Microsoft JhengHei" w:hAnsi="Microsoft JhengHei"/>
@@ -7494,6 +8751,930 @@
           <w:sz w:val="21"/>
           <w:szCs w:val="21"/>
         </w:rPr>
+        <w:t xml:space="preserve">三週期累積結果：</w:t>
+      </w:r>
+      <w:r>
+        <w:rPr>
+          <w:rFonts w:ascii="Microsoft JhengHei" w:cs="Microsoft JhengHei" w:eastAsia="Microsoft JhengHei" w:hAnsi="Microsoft JhengHei"/>
+          <w:sz w:val="21"/>
+          <w:szCs w:val="21"/>
+        </w:rPr>
+        <w:t xml:space="preserve"> 本金恢復為 $1,000,000（依原轉換價換回，名目本金未減損）＋ 累積權利金 $7,671.23+$5,822.71+$7,041.53 = </w:t>
+      </w:r>
+      <w:r>
+        <w:rPr>
+          <w:rFonts w:ascii="Microsoft JhengHei" w:cs="Microsoft JhengHei" w:eastAsia="Microsoft JhengHei" w:hAnsi="Microsoft JhengHei"/>
+          <w:b/>
+          <w:bCs/>
+          <w:sz w:val="21"/>
+          <w:szCs w:val="21"/>
+        </w:rPr>
+        <w:t xml:space="preserve">$20,535.47</w:t>
+      </w:r>
+      <w:r>
+        <w:rPr>
+          <w:rFonts w:ascii="Microsoft JhengHei" w:cs="Microsoft JhengHei" w:eastAsia="Microsoft JhengHei" w:hAnsi="Microsoft JhengHei"/>
+          <w:sz w:val="21"/>
+          <w:szCs w:val="21"/>
+        </w:rPr>
+        <w:t xml:space="preserve">，總計 </w:t>
+      </w:r>
+      <w:r>
+        <w:rPr>
+          <w:rFonts w:ascii="Microsoft JhengHei" w:cs="Microsoft JhengHei" w:eastAsia="Microsoft JhengHei" w:hAnsi="Microsoft JhengHei"/>
+          <w:b/>
+          <w:bCs/>
+          <w:sz w:val="21"/>
+          <w:szCs w:val="21"/>
+        </w:rPr>
+        <w:t xml:space="preserve">$1,020,535.47</w:t>
+      </w:r>
+      <w:r>
+        <w:rPr>
+          <w:rFonts w:ascii="Microsoft JhengHei" w:cs="Microsoft JhengHei" w:eastAsia="Microsoft JhengHei" w:hAnsi="Microsoft JhengHei"/>
+          <w:sz w:val="21"/>
+          <w:szCs w:val="21"/>
+        </w:rPr>
+        <w:t xml:space="preserve">（三週報酬率 +2.05%，約當年化 +38%）。此例證實：</w:t>
+      </w:r>
+      <w:r>
+        <w:rPr>
+          <w:rFonts w:ascii="Microsoft JhengHei" w:cs="Microsoft JhengHei" w:eastAsia="Microsoft JhengHei" w:hAnsi="Microsoft JhengHei"/>
+          <w:b/>
+          <w:bCs/>
+          <w:sz w:val="21"/>
+          <w:szCs w:val="21"/>
+        </w:rPr>
+        <w:t xml:space="preserve">只要最終價格確實回升至原轉換價，「不實現帳面跌幅、持續滾動掛單」確實可將原本單一週期之帳面浮虧，轉換為持有期間之正報酬</w:t>
+      </w:r>
+      <w:r>
+        <w:rPr>
+          <w:rFonts w:ascii="Microsoft JhengHei" w:cs="Microsoft JhengHei" w:eastAsia="Microsoft JhengHei" w:hAnsi="Microsoft JhengHei"/>
+          <w:sz w:val="21"/>
+          <w:szCs w:val="21"/>
+        </w:rPr>
+        <w:t xml:space="preserve">，此為使用者所提策略之正確且有價值之洞察。</w:t>
+      </w:r>
+    </w:p>
+    <w:p>
+      <w:pPr>
+        <w:pStyle w:val="Heading4"/>
+        <w:spacing w:after="100" w:before="180"/>
+      </w:pPr>
+      <w:r>
+        <w:rPr>
+          <w:rFonts w:ascii="Microsoft JhengHei" w:cs="Microsoft JhengHei" w:eastAsia="Microsoft JhengHei" w:hAnsi="Microsoft JhengHei"/>
+          <w:b/>
+          <w:bCs/>
+          <w:color w:val="44546A"/>
+          <w:sz w:val="21"/>
+          <w:szCs w:val="21"/>
+        </w:rPr>
+        <w:t xml:space="preserve">6.4.2 需要財務部審慎理解之三項限制（此策略「不會虧錢」之精確條件）</w:t>
+      </w:r>
+    </w:p>
+    <w:p>
+      <w:pPr>
+        <w:spacing w:after="160" w:line="300"/>
+      </w:pPr>
+      <w:r>
+        <w:rPr>
+          <w:rFonts w:ascii="Microsoft JhengHei" w:cs="Microsoft JhengHei" w:eastAsia="Microsoft JhengHei" w:hAnsi="Microsoft JhengHei"/>
+          <w:sz w:val="21"/>
+          <w:szCs w:val="21"/>
+        </w:rPr>
+        <w:t xml:space="preserve">1. </w:t>
+      </w:r>
+      <w:r>
+        <w:rPr>
+          <w:rFonts w:ascii="Microsoft JhengHei" w:cs="Microsoft JhengHei" w:eastAsia="Microsoft JhengHei" w:hAnsi="Microsoft JhengHei"/>
+          <w:b/>
+          <w:bCs/>
+          <w:sz w:val="21"/>
+          <w:szCs w:val="21"/>
+        </w:rPr>
+        <w:t xml:space="preserve">權利金隨價格乖離擴大而遞減，而非維持初始水準：</w:t>
+      </w:r>
+      <w:r>
+        <w:rPr>
+          <w:rFonts w:ascii="Microsoft JhengHei" w:cs="Microsoft JhengHei" w:eastAsia="Microsoft JhengHei" w:hAnsi="Microsoft JhengHei"/>
+          <w:sz w:val="21"/>
+          <w:szCs w:val="21"/>
+        </w:rPr>
+        <w:t xml:space="preserve"> 選擇權定價原則下，行使價與現貨價之距離（Strike Distance）越遠，履約機率越低，市場願意支付之權利金亦隨之下降。若價格持續下跌而遠離固定之 $55,900 行使價（例如跌至 $40,000，乖離幅度擴大至近 40%），該檔位所能取得之年化權利金通常會</w:t>
+      </w:r>
+      <w:r>
+        <w:rPr>
+          <w:rFonts w:ascii="Microsoft JhengHei" w:cs="Microsoft JhengHei" w:eastAsia="Microsoft JhengHei" w:hAnsi="Microsoft JhengHei"/>
+          <w:b/>
+          <w:bCs/>
+          <w:sz w:val="21"/>
+          <w:szCs w:val="21"/>
+        </w:rPr>
+        <w:t xml:space="preserve">顯著萎縮至個位數百分比</w:t>
+      </w:r>
+      <w:r>
+        <w:rPr>
+          <w:rFonts w:ascii="Microsoft JhengHei" w:cs="Microsoft JhengHei" w:eastAsia="Microsoft JhengHei" w:hAnsi="Microsoft JhengHei"/>
+          <w:sz w:val="21"/>
+          <w:szCs w:val="21"/>
+        </w:rPr>
+        <w:t xml:space="preserve">，而非維持第 1–3 週示範中之 30%+ 水準——</w:t>
+      </w:r>
+      <w:r>
+        <w:rPr>
+          <w:rFonts w:ascii="Microsoft JhengHei" w:cs="Microsoft JhengHei" w:eastAsia="Microsoft JhengHei" w:hAnsi="Microsoft JhengHei"/>
+          <w:b/>
+          <w:bCs/>
+          <w:sz w:val="21"/>
+          <w:szCs w:val="21"/>
+        </w:rPr>
+        <w:t xml:space="preserve">滾動策略之「以權利金彌補等待成本」效果會隨套牢深度加深而遞減</w:t>
+      </w:r>
+      <w:r>
+        <w:rPr>
+          <w:rFonts w:ascii="Microsoft JhengHei" w:cs="Microsoft JhengHei" w:eastAsia="Microsoft JhengHei" w:hAnsi="Microsoft JhengHei"/>
+          <w:sz w:val="21"/>
+          <w:szCs w:val="21"/>
+        </w:rPr>
+        <w:t xml:space="preserve">。</w:t>
+      </w:r>
+    </w:p>
+    <w:p>
+      <w:pPr>
+        <w:spacing w:after="160" w:line="300"/>
+      </w:pPr>
+      <w:r>
+        <w:rPr>
+          <w:rFonts w:ascii="Microsoft JhengHei" w:cs="Microsoft JhengHei" w:eastAsia="Microsoft JhengHei" w:hAnsi="Microsoft JhengHei"/>
+          <w:sz w:val="21"/>
+          <w:szCs w:val="21"/>
+        </w:rPr>
+        <w:t xml:space="preserve">2. </w:t>
+      </w:r>
+      <w:r>
+        <w:rPr>
+          <w:rFonts w:ascii="Microsoft JhengHei" w:cs="Microsoft JhengHei" w:eastAsia="Microsoft JhengHei" w:hAnsi="Microsoft JhengHei"/>
+          <w:b/>
+          <w:bCs/>
+          <w:sz w:val="21"/>
+          <w:szCs w:val="21"/>
+        </w:rPr>
+        <w:t xml:space="preserve">本金安全僅相對於「原轉換價」成立，且沒有時間保證：</w:t>
+      </w:r>
+      <w:r>
+        <w:rPr>
+          <w:rFonts w:ascii="Microsoft JhengHei" w:cs="Microsoft JhengHei" w:eastAsia="Microsoft JhengHei" w:hAnsi="Microsoft JhengHei"/>
+          <w:sz w:val="21"/>
+          <w:szCs w:val="21"/>
+        </w:rPr>
+        <w:t xml:space="preserve"> 「不會虧錢」之敘述，精確條件應為「</w:t>
+      </w:r>
+      <w:r>
+        <w:rPr>
+          <w:rFonts w:ascii="Microsoft JhengHei" w:cs="Microsoft JhengHei" w:eastAsia="Microsoft JhengHei" w:hAnsi="Microsoft JhengHei"/>
+          <w:b/>
+          <w:bCs/>
+          <w:sz w:val="21"/>
+          <w:szCs w:val="21"/>
+        </w:rPr>
+        <w:t xml:space="preserve">只要最終確實回升至原轉換價，且過程中未改用更低之行使價</w:t>
+      </w:r>
+      <w:r>
+        <w:rPr>
+          <w:rFonts w:ascii="Microsoft JhengHei" w:cs="Microsoft JhengHei" w:eastAsia="Microsoft JhengHei" w:hAnsi="Microsoft JhengHei"/>
+          <w:sz w:val="21"/>
+          <w:szCs w:val="21"/>
+        </w:rPr>
+        <w:t xml:space="preserve">」；價格回升所需之時間並無保證，可能是 3 週，也可能是數月甚至數年未能回升，資金在此期間</w:t>
+      </w:r>
+      <w:r>
+        <w:rPr>
+          <w:rFonts w:ascii="Microsoft JhengHei" w:cs="Microsoft JhengHei" w:eastAsia="Microsoft JhengHei" w:hAnsi="Microsoft JhengHei"/>
+          <w:b/>
+          <w:bCs/>
+          <w:sz w:val="21"/>
+          <w:szCs w:val="21"/>
+        </w:rPr>
+        <w:t xml:space="preserve">無法投入本報告第 3–5 章所述之其他生息工具</w:t>
+      </w:r>
+      <w:r>
+        <w:rPr>
+          <w:rFonts w:ascii="Microsoft JhengHei" w:cs="Microsoft JhengHei" w:eastAsia="Microsoft JhengHei" w:hAnsi="Microsoft JhengHei"/>
+          <w:sz w:val="21"/>
+          <w:szCs w:val="21"/>
+        </w:rPr>
+        <w:t xml:space="preserve">，構成實質之機會成本。</w:t>
+      </w:r>
+    </w:p>
+    <w:p>
+      <w:pPr>
+        <w:spacing w:after="160" w:line="300"/>
+      </w:pPr>
+      <w:r>
+        <w:rPr>
+          <w:rFonts w:ascii="Microsoft JhengHei" w:cs="Microsoft JhengHei" w:eastAsia="Microsoft JhengHei" w:hAnsi="Microsoft JhengHei"/>
+          <w:sz w:val="21"/>
+          <w:szCs w:val="21"/>
+        </w:rPr>
+        <w:t xml:space="preserve">3. </w:t>
+      </w:r>
+      <w:r>
+        <w:rPr>
+          <w:rFonts w:ascii="Microsoft JhengHei" w:cs="Microsoft JhengHei" w:eastAsia="Microsoft JhengHei" w:hAnsi="Microsoft JhengHei"/>
+          <w:b/>
+          <w:bCs/>
+          <w:sz w:val="21"/>
+          <w:szCs w:val="21"/>
+        </w:rPr>
+        <w:t xml:space="preserve">會計與財務報表上仍須認列未實現損益：</w:t>
+      </w:r>
+      <w:r>
+        <w:rPr>
+          <w:rFonts w:ascii="Microsoft JhengHei" w:cs="Microsoft JhengHei" w:eastAsia="Microsoft JhengHei" w:hAnsi="Microsoft JhengHei"/>
+          <w:sz w:val="21"/>
+          <w:szCs w:val="21"/>
+        </w:rPr>
+        <w:t xml:space="preserve"> 依第 8 章所述，雙幣理財部位應以公允價值列入損益（FVTPL）；在價格尚未回升至原轉換價之任何一個報表結算日，所持有之 BTC 部位</w:t>
+      </w:r>
+      <w:r>
+        <w:rPr>
+          <w:rFonts w:ascii="Microsoft JhengHei" w:cs="Microsoft JhengHei" w:eastAsia="Microsoft JhengHei" w:hAnsi="Microsoft JhengHei"/>
+          <w:b/>
+          <w:bCs/>
+          <w:sz w:val="21"/>
+          <w:szCs w:val="21"/>
+        </w:rPr>
+        <w:t xml:space="preserve">仍須依當時市價評價，並認列未實現跌價損失</w:t>
+      </w:r>
+      <w:r>
+        <w:rPr>
+          <w:rFonts w:ascii="Microsoft JhengHei" w:cs="Microsoft JhengHei" w:eastAsia="Microsoft JhengHei" w:hAnsi="Microsoft JhengHei"/>
+          <w:sz w:val="21"/>
+          <w:szCs w:val="21"/>
+        </w:rPr>
+        <w:t xml:space="preserve">，即使企業主觀上「不打算實現虧損」。以下方 6.4.3 節之對照情境為例，此一未實現損失金額可能相當可觀，財務部於審閱本策略時應將其視為</w:t>
+      </w:r>
+      <w:r>
+        <w:rPr>
+          <w:rFonts w:ascii="Microsoft JhengHei" w:cs="Microsoft JhengHei" w:eastAsia="Microsoft JhengHei" w:hAnsi="Microsoft JhengHei"/>
+          <w:b/>
+          <w:bCs/>
+          <w:sz w:val="21"/>
+          <w:szCs w:val="21"/>
+        </w:rPr>
+        <w:t xml:space="preserve">流動性與帳面評價風險</w:t>
+      </w:r>
+      <w:r>
+        <w:rPr>
+          <w:rFonts w:ascii="Microsoft JhengHei" w:cs="Microsoft JhengHei" w:eastAsia="Microsoft JhengHei" w:hAnsi="Microsoft JhengHei"/>
+          <w:sz w:val="21"/>
+          <w:szCs w:val="21"/>
+        </w:rPr>
+        <w:t xml:space="preserve">，而非「零風險」之收益增強手段。</w:t>
+      </w:r>
+    </w:p>
+    <w:p>
+      <w:pPr>
+        <w:pStyle w:val="Heading4"/>
+        <w:spacing w:after="100" w:before="180"/>
+      </w:pPr>
+      <w:r>
+        <w:rPr>
+          <w:rFonts w:ascii="Microsoft JhengHei" w:cs="Microsoft JhengHei" w:eastAsia="Microsoft JhengHei" w:hAnsi="Microsoft JhengHei"/>
+          <w:b/>
+          <w:bCs/>
+          <w:color w:val="44546A"/>
+          <w:sz w:val="21"/>
+          <w:szCs w:val="21"/>
+        </w:rPr>
+        <w:t xml:space="preserve">6.4.3 對照情境：價格長期未回升至轉換價</w:t>
+      </w:r>
+    </w:p>
+    <w:tbl>
+      <w:tblPr>
+        <w:tblW w:type="dxa" w:w="9350"/>
+        <w:tblBorders>
+          <w:top w:val="single" w:color="auto" w:sz="4"/>
+          <w:left w:val="single" w:color="auto" w:sz="4"/>
+          <w:bottom w:val="single" w:color="auto" w:sz="4"/>
+          <w:right w:val="single" w:color="auto" w:sz="4"/>
+          <w:insideH w:val="single" w:color="auto" w:sz="4"/>
+          <w:insideV w:val="single" w:color="auto" w:sz="4"/>
+        </w:tblBorders>
+      </w:tblPr>
+      <w:tblGrid>
+        <w:gridCol w:w="4675"/>
+        <w:gridCol w:w="4675"/>
+      </w:tblGrid>
+      <w:tr>
+        <w:trPr>
+          <w:tblHeader/>
+        </w:trPr>
+        <w:tc>
+          <w:tcPr>
+            <w:tcW w:type="dxa" w:w="4675"/>
+            <w:tcBorders>
+              <w:top w:val="single" w:color="9DB3C8" w:sz="4"/>
+              <w:left w:val="single" w:color="9DB3C8" w:sz="4"/>
+              <w:bottom w:val="single" w:color="9DB3C8" w:sz="4"/>
+              <w:right w:val="single" w:color="9DB3C8" w:sz="4"/>
+            </w:tcBorders>
+            <w:shd w:fill="1F3864" w:val="clear"/>
+            <w:tcMar>
+              <w:top w:type="dxa" w:w="80"/>
+              <w:left w:type="dxa" w:w="100"/>
+              <w:bottom w:type="dxa" w:w="80"/>
+              <w:right w:type="dxa" w:w="100"/>
+            </w:tcMar>
+            <w:vAlign w:val="center"/>
+          </w:tcPr>
+          <w:p>
+            <w:r>
+              <w:rPr>
+                <w:rFonts w:ascii="Microsoft JhengHei" w:cs="Microsoft JhengHei" w:eastAsia="Microsoft JhengHei" w:hAnsi="Microsoft JhengHei"/>
+                <w:b/>
+                <w:bCs/>
+                <w:color w:val="FFFFFF"/>
+                <w:sz w:val="19"/>
+                <w:szCs w:val="19"/>
+              </w:rPr>
+              <w:t xml:space="preserve">項目</w:t>
+            </w:r>
+          </w:p>
+        </w:tc>
+        <w:tc>
+          <w:tcPr>
+            <w:tcW w:type="dxa" w:w="4675"/>
+            <w:tcBorders>
+              <w:top w:val="single" w:color="9DB3C8" w:sz="4"/>
+              <w:left w:val="single" w:color="9DB3C8" w:sz="4"/>
+              <w:bottom w:val="single" w:color="9DB3C8" w:sz="4"/>
+              <w:right w:val="single" w:color="9DB3C8" w:sz="4"/>
+            </w:tcBorders>
+            <w:shd w:fill="1F3864" w:val="clear"/>
+            <w:tcMar>
+              <w:top w:type="dxa" w:w="80"/>
+              <w:left w:type="dxa" w:w="100"/>
+              <w:bottom w:type="dxa" w:w="80"/>
+              <w:right w:type="dxa" w:w="100"/>
+            </w:tcMar>
+            <w:vAlign w:val="center"/>
+          </w:tcPr>
+          <w:p>
+            <w:r>
+              <w:rPr>
+                <w:rFonts w:ascii="Microsoft JhengHei" w:cs="Microsoft JhengHei" w:eastAsia="Microsoft JhengHei" w:hAnsi="Microsoft JhengHei"/>
+                <w:b/>
+                <w:bCs/>
+                <w:color w:val="FFFFFF"/>
+                <w:sz w:val="19"/>
+                <w:szCs w:val="19"/>
+              </w:rPr>
+              <w:t xml:space="preserve">數值</w:t>
+            </w:r>
+          </w:p>
+        </w:tc>
+      </w:tr>
+      <w:tr>
+        <w:tc>
+          <w:tcPr>
+            <w:tcW w:type="dxa" w:w="4675"/>
+            <w:tcBorders>
+              <w:top w:val="single" w:color="9DB3C8" w:sz="4"/>
+              <w:left w:val="single" w:color="9DB3C8" w:sz="4"/>
+              <w:bottom w:val="single" w:color="9DB3C8" w:sz="4"/>
+              <w:right w:val="single" w:color="9DB3C8" w:sz="4"/>
+            </w:tcBorders>
+            <w:tcMar>
+              <w:top w:type="dxa" w:w="80"/>
+              <w:left w:type="dxa" w:w="100"/>
+              <w:bottom w:type="dxa" w:w="80"/>
+              <w:right w:type="dxa" w:w="100"/>
+            </w:tcMar>
+            <w:vAlign w:val="center"/>
+          </w:tcPr>
+          <w:p>
+            <w:pPr>
+              <w:spacing w:line="264"/>
+            </w:pPr>
+            <w:r>
+              <w:rPr>
+                <w:rFonts w:ascii="Microsoft JhengHei" w:cs="Microsoft JhengHei" w:eastAsia="Microsoft JhengHei" w:hAnsi="Microsoft JhengHei"/>
+                <w:sz w:val="18"/>
+                <w:szCs w:val="18"/>
+              </w:rPr>
+              <w:t xml:space="preserve">第 1 週轉換後持有 BTC 數量</w:t>
+            </w:r>
+          </w:p>
+        </w:tc>
+        <w:tc>
+          <w:tcPr>
+            <w:tcW w:type="dxa" w:w="4675"/>
+            <w:tcBorders>
+              <w:top w:val="single" w:color="9DB3C8" w:sz="4"/>
+              <w:left w:val="single" w:color="9DB3C8" w:sz="4"/>
+              <w:bottom w:val="single" w:color="9DB3C8" w:sz="4"/>
+              <w:right w:val="single" w:color="9DB3C8" w:sz="4"/>
+            </w:tcBorders>
+            <w:tcMar>
+              <w:top w:type="dxa" w:w="80"/>
+              <w:left w:type="dxa" w:w="100"/>
+              <w:bottom w:type="dxa" w:w="80"/>
+              <w:right w:type="dxa" w:w="100"/>
+            </w:tcMar>
+            <w:vAlign w:val="center"/>
+          </w:tcPr>
+          <w:p>
+            <w:pPr>
+              <w:spacing w:line="264"/>
+            </w:pPr>
+            <w:r>
+              <w:rPr>
+                <w:rFonts w:ascii="Microsoft JhengHei" w:cs="Microsoft JhengHei" w:eastAsia="Microsoft JhengHei" w:hAnsi="Microsoft JhengHei"/>
+                <w:sz w:val="18"/>
+                <w:szCs w:val="18"/>
+              </w:rPr>
+              <w:t xml:space="preserve">17.8891 BTC</w:t>
+            </w:r>
+          </w:p>
+        </w:tc>
+      </w:tr>
+      <w:tr>
+        <w:tc>
+          <w:tcPr>
+            <w:tcW w:type="dxa" w:w="4675"/>
+            <w:tcBorders>
+              <w:top w:val="single" w:color="9DB3C8" w:sz="4"/>
+              <w:left w:val="single" w:color="9DB3C8" w:sz="4"/>
+              <w:bottom w:val="single" w:color="9DB3C8" w:sz="4"/>
+              <w:right w:val="single" w:color="9DB3C8" w:sz="4"/>
+            </w:tcBorders>
+            <w:tcMar>
+              <w:top w:type="dxa" w:w="80"/>
+              <w:left w:type="dxa" w:w="100"/>
+              <w:bottom w:type="dxa" w:w="80"/>
+              <w:right w:type="dxa" w:w="100"/>
+            </w:tcMar>
+            <w:vAlign w:val="center"/>
+          </w:tcPr>
+          <w:p>
+            <w:pPr>
+              <w:spacing w:line="264"/>
+            </w:pPr>
+            <w:r>
+              <w:rPr>
+                <w:rFonts w:ascii="Microsoft JhengHei" w:cs="Microsoft JhengHei" w:eastAsia="Microsoft JhengHei" w:hAnsi="Microsoft JhengHei"/>
+                <w:sz w:val="18"/>
+                <w:szCs w:val="18"/>
+              </w:rPr>
+              <w:t xml:space="preserve">假設後續 10 週價格持續走低並盤整於 $40,000，</w:t>
+            </w:r>
+            <w:r>
+              <w:rPr>
+                <w:rFonts w:ascii="Microsoft JhengHei" w:cs="Microsoft JhengHei" w:eastAsia="Microsoft JhengHei" w:hAnsi="Microsoft JhengHei"/>
+                <w:b/>
+                <w:bCs/>
+                <w:sz w:val="18"/>
+                <w:szCs w:val="18"/>
+              </w:rPr>
+              <w:t xml:space="preserve">未曾</w:t>
+            </w:r>
+            <w:r>
+              <w:rPr>
+                <w:rFonts w:ascii="Microsoft JhengHei" w:cs="Microsoft JhengHei" w:eastAsia="Microsoft JhengHei" w:hAnsi="Microsoft JhengHei"/>
+                <w:sz w:val="18"/>
+                <w:szCs w:val="18"/>
+              </w:rPr>
+              <w:t xml:space="preserve">回升至 $55,900</w:t>
+            </w:r>
+          </w:p>
+        </w:tc>
+        <w:tc>
+          <w:tcPr>
+            <w:tcW w:type="dxa" w:w="4675"/>
+            <w:tcBorders>
+              <w:top w:val="single" w:color="9DB3C8" w:sz="4"/>
+              <w:left w:val="single" w:color="9DB3C8" w:sz="4"/>
+              <w:bottom w:val="single" w:color="9DB3C8" w:sz="4"/>
+              <w:right w:val="single" w:color="9DB3C8" w:sz="4"/>
+            </w:tcBorders>
+            <w:tcMar>
+              <w:top w:type="dxa" w:w="80"/>
+              <w:left w:type="dxa" w:w="100"/>
+              <w:bottom w:type="dxa" w:w="80"/>
+              <w:right w:type="dxa" w:w="100"/>
+            </w:tcMar>
+            <w:vAlign w:val="center"/>
+          </w:tcPr>
+          <w:p>
+            <w:pPr>
+              <w:spacing w:line="264"/>
+            </w:pPr>
+            <w:r>
+              <w:rPr>
+                <w:rFonts w:ascii="Microsoft JhengHei" w:cs="Microsoft JhengHei" w:eastAsia="Microsoft JhengHei" w:hAnsi="Microsoft JhengHei"/>
+                <w:sz w:val="18"/>
+                <w:szCs w:val="18"/>
+              </w:rPr>
+              <w:t xml:space="preserve">—</w:t>
+            </w:r>
+          </w:p>
+        </w:tc>
+      </w:tr>
+      <w:tr>
+        <w:tc>
+          <w:tcPr>
+            <w:tcW w:type="dxa" w:w="4675"/>
+            <w:tcBorders>
+              <w:top w:val="single" w:color="9DB3C8" w:sz="4"/>
+              <w:left w:val="single" w:color="9DB3C8" w:sz="4"/>
+              <w:bottom w:val="single" w:color="9DB3C8" w:sz="4"/>
+              <w:right w:val="single" w:color="9DB3C8" w:sz="4"/>
+            </w:tcBorders>
+            <w:tcMar>
+              <w:top w:type="dxa" w:w="80"/>
+              <w:left w:type="dxa" w:w="100"/>
+              <w:bottom w:type="dxa" w:w="80"/>
+              <w:right w:type="dxa" w:w="100"/>
+            </w:tcMar>
+            <w:vAlign w:val="center"/>
+          </w:tcPr>
+          <w:p>
+            <w:pPr>
+              <w:spacing w:line="264"/>
+            </w:pPr>
+            <w:r>
+              <w:rPr>
+                <w:rFonts w:ascii="Microsoft JhengHei" w:cs="Microsoft JhengHei" w:eastAsia="Microsoft JhengHei" w:hAnsi="Microsoft JhengHei"/>
+                <w:sz w:val="18"/>
+                <w:szCs w:val="18"/>
+              </w:rPr>
+              <w:t xml:space="preserve">10 週內以遞減年化（示意約 32% → 5%）持續滾動「高賣」之累積權利金（示意）</w:t>
+            </w:r>
+          </w:p>
+        </w:tc>
+        <w:tc>
+          <w:tcPr>
+            <w:tcW w:type="dxa" w:w="4675"/>
+            <w:tcBorders>
+              <w:top w:val="single" w:color="9DB3C8" w:sz="4"/>
+              <w:left w:val="single" w:color="9DB3C8" w:sz="4"/>
+              <w:bottom w:val="single" w:color="9DB3C8" w:sz="4"/>
+              <w:right w:val="single" w:color="9DB3C8" w:sz="4"/>
+            </w:tcBorders>
+            <w:tcMar>
+              <w:top w:type="dxa" w:w="80"/>
+              <w:left w:type="dxa" w:w="100"/>
+              <w:bottom w:type="dxa" w:w="80"/>
+              <w:right w:type="dxa" w:w="100"/>
+            </w:tcMar>
+            <w:vAlign w:val="center"/>
+          </w:tcPr>
+          <w:p>
+            <w:pPr>
+              <w:spacing w:line="264"/>
+            </w:pPr>
+            <w:r>
+              <w:rPr>
+                <w:rFonts w:ascii="Microsoft JhengHei" w:cs="Microsoft JhengHei" w:eastAsia="Microsoft JhengHei" w:hAnsi="Microsoft JhengHei"/>
+                <w:sz w:val="18"/>
+                <w:szCs w:val="18"/>
+              </w:rPr>
+              <w:t xml:space="preserve">約 $9,000–$12,000</w:t>
+            </w:r>
+          </w:p>
+        </w:tc>
+      </w:tr>
+      <w:tr>
+        <w:tc>
+          <w:tcPr>
+            <w:tcW w:type="dxa" w:w="4675"/>
+            <w:tcBorders>
+              <w:top w:val="single" w:color="9DB3C8" w:sz="4"/>
+              <w:left w:val="single" w:color="9DB3C8" w:sz="4"/>
+              <w:bottom w:val="single" w:color="9DB3C8" w:sz="4"/>
+              <w:right w:val="single" w:color="9DB3C8" w:sz="4"/>
+            </w:tcBorders>
+            <w:tcMar>
+              <w:top w:type="dxa" w:w="80"/>
+              <w:left w:type="dxa" w:w="100"/>
+              <w:bottom w:type="dxa" w:w="80"/>
+              <w:right w:type="dxa" w:w="100"/>
+            </w:tcMar>
+            <w:vAlign w:val="center"/>
+          </w:tcPr>
+          <w:p>
+            <w:pPr>
+              <w:spacing w:line="264"/>
+            </w:pPr>
+            <w:r>
+              <w:rPr>
+                <w:rFonts w:ascii="Microsoft JhengHei" w:cs="Microsoft JhengHei" w:eastAsia="Microsoft JhengHei" w:hAnsi="Microsoft JhengHei"/>
+                <w:sz w:val="18"/>
+                <w:szCs w:val="18"/>
+              </w:rPr>
+              <w:t xml:space="preserve">第 10 週末 BTC 部位市值（17.8891 × $40,000）</w:t>
+            </w:r>
+          </w:p>
+        </w:tc>
+        <w:tc>
+          <w:tcPr>
+            <w:tcW w:type="dxa" w:w="4675"/>
+            <w:tcBorders>
+              <w:top w:val="single" w:color="9DB3C8" w:sz="4"/>
+              <w:left w:val="single" w:color="9DB3C8" w:sz="4"/>
+              <w:bottom w:val="single" w:color="9DB3C8" w:sz="4"/>
+              <w:right w:val="single" w:color="9DB3C8" w:sz="4"/>
+            </w:tcBorders>
+            <w:tcMar>
+              <w:top w:type="dxa" w:w="80"/>
+              <w:left w:type="dxa" w:w="100"/>
+              <w:bottom w:type="dxa" w:w="80"/>
+              <w:right w:type="dxa" w:w="100"/>
+            </w:tcMar>
+            <w:vAlign w:val="center"/>
+          </w:tcPr>
+          <w:p>
+            <w:pPr>
+              <w:spacing w:line="264"/>
+            </w:pPr>
+            <w:r>
+              <w:rPr>
+                <w:rFonts w:ascii="Microsoft JhengHei" w:cs="Microsoft JhengHei" w:eastAsia="Microsoft JhengHei" w:hAnsi="Microsoft JhengHei"/>
+                <w:sz w:val="18"/>
+                <w:szCs w:val="18"/>
+              </w:rPr>
+              <w:t xml:space="preserve">$715,564</w:t>
+            </w:r>
+          </w:p>
+        </w:tc>
+      </w:tr>
+      <w:tr>
+        <w:tc>
+          <w:tcPr>
+            <w:tcW w:type="dxa" w:w="4675"/>
+            <w:tcBorders>
+              <w:top w:val="single" w:color="9DB3C8" w:sz="4"/>
+              <w:left w:val="single" w:color="9DB3C8" w:sz="4"/>
+              <w:bottom w:val="single" w:color="9DB3C8" w:sz="4"/>
+              <w:right w:val="single" w:color="9DB3C8" w:sz="4"/>
+            </w:tcBorders>
+            <w:tcMar>
+              <w:top w:type="dxa" w:w="80"/>
+              <w:left w:type="dxa" w:w="100"/>
+              <w:bottom w:type="dxa" w:w="80"/>
+              <w:right w:type="dxa" w:w="100"/>
+            </w:tcMar>
+            <w:vAlign w:val="center"/>
+          </w:tcPr>
+          <w:p>
+            <w:pPr>
+              <w:spacing w:line="264"/>
+            </w:pPr>
+            <w:r>
+              <w:rPr>
+                <w:rFonts w:ascii="Microsoft JhengHei" w:cs="Microsoft JhengHei" w:eastAsia="Microsoft JhengHei" w:hAnsi="Microsoft JhengHei"/>
+                <w:b/>
+                <w:bCs/>
+                <w:sz w:val="18"/>
+                <w:szCs w:val="18"/>
+              </w:rPr>
+              <w:t xml:space="preserve">相較原始本金名目值之未實現跌價損失</w:t>
+            </w:r>
+          </w:p>
+        </w:tc>
+        <w:tc>
+          <w:tcPr>
+            <w:tcW w:type="dxa" w:w="4675"/>
+            <w:tcBorders>
+              <w:top w:val="single" w:color="9DB3C8" w:sz="4"/>
+              <w:left w:val="single" w:color="9DB3C8" w:sz="4"/>
+              <w:bottom w:val="single" w:color="9DB3C8" w:sz="4"/>
+              <w:right w:val="single" w:color="9DB3C8" w:sz="4"/>
+            </w:tcBorders>
+            <w:tcMar>
+              <w:top w:type="dxa" w:w="80"/>
+              <w:left w:type="dxa" w:w="100"/>
+              <w:bottom w:type="dxa" w:w="80"/>
+              <w:right w:type="dxa" w:w="100"/>
+            </w:tcMar>
+            <w:vAlign w:val="center"/>
+          </w:tcPr>
+          <w:p>
+            <w:pPr>
+              <w:spacing w:line="264"/>
+            </w:pPr>
+            <w:r>
+              <w:rPr>
+                <w:rFonts w:ascii="Microsoft JhengHei" w:cs="Microsoft JhengHei" w:eastAsia="Microsoft JhengHei" w:hAnsi="Microsoft JhengHei"/>
+                <w:b/>
+                <w:bCs/>
+                <w:sz w:val="18"/>
+                <w:szCs w:val="18"/>
+              </w:rPr>
+              <w:t xml:space="preserve">約 -$284,436（-28.4%）</w:t>
+            </w:r>
+          </w:p>
+        </w:tc>
+      </w:tr>
+      <w:tr>
+        <w:tc>
+          <w:tcPr>
+            <w:tcW w:type="dxa" w:w="4675"/>
+            <w:tcBorders>
+              <w:top w:val="single" w:color="9DB3C8" w:sz="4"/>
+              <w:left w:val="single" w:color="9DB3C8" w:sz="4"/>
+              <w:bottom w:val="single" w:color="9DB3C8" w:sz="4"/>
+              <w:right w:val="single" w:color="9DB3C8" w:sz="4"/>
+            </w:tcBorders>
+            <w:tcMar>
+              <w:top w:type="dxa" w:w="80"/>
+              <w:left w:type="dxa" w:w="100"/>
+              <w:bottom w:type="dxa" w:w="80"/>
+              <w:right w:type="dxa" w:w="100"/>
+            </w:tcMar>
+            <w:vAlign w:val="center"/>
+          </w:tcPr>
+          <w:p>
+            <w:pPr>
+              <w:spacing w:line="264"/>
+            </w:pPr>
+            <w:r>
+              <w:rPr>
+                <w:rFonts w:ascii="Microsoft JhengHei" w:cs="Microsoft JhengHei" w:eastAsia="Microsoft JhengHei" w:hAnsi="Microsoft JhengHei"/>
+                <w:sz w:val="18"/>
+                <w:szCs w:val="18"/>
+              </w:rPr>
+              <w:t xml:space="preserve">財務報表上之處理</w:t>
+            </w:r>
+          </w:p>
+        </w:tc>
+        <w:tc>
+          <w:tcPr>
+            <w:tcW w:type="dxa" w:w="4675"/>
+            <w:tcBorders>
+              <w:top w:val="single" w:color="9DB3C8" w:sz="4"/>
+              <w:left w:val="single" w:color="9DB3C8" w:sz="4"/>
+              <w:bottom w:val="single" w:color="9DB3C8" w:sz="4"/>
+              <w:right w:val="single" w:color="9DB3C8" w:sz="4"/>
+            </w:tcBorders>
+            <w:tcMar>
+              <w:top w:type="dxa" w:w="80"/>
+              <w:left w:type="dxa" w:w="100"/>
+              <w:bottom w:type="dxa" w:w="80"/>
+              <w:right w:type="dxa" w:w="100"/>
+            </w:tcMar>
+            <w:vAlign w:val="center"/>
+          </w:tcPr>
+          <w:p>
+            <w:pPr>
+              <w:spacing w:line="264"/>
+            </w:pPr>
+            <w:r>
+              <w:rPr>
+                <w:rFonts w:ascii="Microsoft JhengHei" w:cs="Microsoft JhengHei" w:eastAsia="Microsoft JhengHei" w:hAnsi="Microsoft JhengHei"/>
+                <w:sz w:val="18"/>
+                <w:szCs w:val="18"/>
+              </w:rPr>
+              <w:t xml:space="preserve">每一報表結算日均須依市價認列未實現損失，直至實際轉換回 USDT 之日為止</w:t>
+            </w:r>
+          </w:p>
+        </w:tc>
+      </w:tr>
+    </w:tbl>
+    <w:p>
+      <w:pPr>
+        <w:spacing w:after="160"/>
+      </w:pPr>
+    </w:p>
+    <w:p>
+      <w:pPr>
+        <w:spacing w:after="160" w:line="300"/>
+      </w:pPr>
+      <w:r>
+        <w:rPr>
+          <w:rFonts w:ascii="Microsoft JhengHei" w:cs="Microsoft JhengHei" w:eastAsia="Microsoft JhengHei" w:hAnsi="Microsoft JhengHei"/>
+          <w:b/>
+          <w:bCs/>
+          <w:sz w:val="21"/>
+          <w:szCs w:val="21"/>
+        </w:rPr>
+        <w:t xml:space="preserve">結論：</w:t>
+      </w:r>
+      <w:r>
+        <w:rPr>
+          <w:rFonts w:ascii="Microsoft JhengHei" w:cs="Microsoft JhengHei" w:eastAsia="Microsoft JhengHei" w:hAnsi="Microsoft JhengHei"/>
+          <w:sz w:val="21"/>
+          <w:szCs w:val="21"/>
+        </w:rPr>
+        <w:t xml:space="preserve"> 使用者提出之滾動掛單策略，在「價格最終確實回升至原轉換價」之路徑下（如 6.4.1 節），確實能將帳面浮虧轉為正報酬，是對第 6.3 節單一週期試算之有效補充；惟此策略之風險並未消失，而是由「單一週期之已實現虧損風險」，轉換為「</w:t>
+      </w:r>
+      <w:r>
+        <w:rPr>
+          <w:rFonts w:ascii="Microsoft JhengHei" w:cs="Microsoft JhengHei" w:eastAsia="Microsoft JhengHei" w:hAnsi="Microsoft JhengHei"/>
+          <w:b/>
+          <w:bCs/>
+          <w:sz w:val="21"/>
+          <w:szCs w:val="21"/>
+        </w:rPr>
+        <w:t xml:space="preserve">權利金隨套牢加深而遞減之收益衰減風險</w:t>
+      </w:r>
+      <w:r>
+        <w:rPr>
+          <w:rFonts w:ascii="Microsoft JhengHei" w:cs="Microsoft JhengHei" w:eastAsia="Microsoft JhengHei" w:hAnsi="Microsoft JhengHei"/>
+          <w:sz w:val="21"/>
+          <w:szCs w:val="21"/>
+        </w:rPr>
+        <w:t xml:space="preserve">」與「</w:t>
+      </w:r>
+      <w:r>
+        <w:rPr>
+          <w:rFonts w:ascii="Microsoft JhengHei" w:cs="Microsoft JhengHei" w:eastAsia="Microsoft JhengHei" w:hAnsi="Microsoft JhengHei"/>
+          <w:b/>
+          <w:bCs/>
+          <w:sz w:val="21"/>
+          <w:szCs w:val="21"/>
+        </w:rPr>
+        <w:t xml:space="preserve">未實現跌價損失之持續期間與會計認列風險</w:t>
+      </w:r>
+      <w:r>
+        <w:rPr>
+          <w:rFonts w:ascii="Microsoft JhengHei" w:cs="Microsoft JhengHei" w:eastAsia="Microsoft JhengHei" w:hAnsi="Microsoft JhengHei"/>
+          <w:sz w:val="21"/>
+          <w:szCs w:val="21"/>
+        </w:rPr>
+        <w:t xml:space="preserve">」——兩種路徑（6.4.1 與 6.4.3）於申購當下均無法預先判斷會實際發生何者。</w:t>
+      </w:r>
+    </w:p>
+    <w:p>
+      <w:pPr>
+        <w:pStyle w:val="Heading3"/>
+        <w:spacing w:after="120" w:before="220"/>
+      </w:pPr>
+      <w:r>
+        <w:rPr>
+          <w:rFonts w:ascii="Microsoft JhengHei" w:cs="Microsoft JhengHei" w:eastAsia="Microsoft JhengHei" w:hAnsi="Microsoft JhengHei"/>
+          <w:b/>
+          <w:bCs/>
+          <w:color w:val="2E5395"/>
+          <w:sz w:val="22"/>
+          <w:szCs w:val="22"/>
+        </w:rPr>
+        <w:t xml:space="preserve">6.5 財務運用場景</w:t>
+      </w:r>
+    </w:p>
+    <w:p>
+      <w:pPr>
+        <w:spacing w:after="160" w:line="300"/>
+      </w:pPr>
+      <w:r>
+        <w:rPr>
+          <w:rFonts w:ascii="Microsoft JhengHei" w:cs="Microsoft JhengHei" w:eastAsia="Microsoft JhengHei" w:hAnsi="Microsoft JhengHei"/>
+          <w:sz w:val="21"/>
+          <w:szCs w:val="21"/>
+        </w:rPr>
+        <w:t xml:space="preserve">1. </w:t>
+      </w:r>
+      <w:r>
+        <w:rPr>
+          <w:rFonts w:ascii="Microsoft JhengHei" w:cs="Microsoft JhengHei" w:eastAsia="Microsoft JhengHei" w:hAnsi="Microsoft JhengHei"/>
+          <w:b/>
+          <w:bCs/>
+          <w:sz w:val="21"/>
+          <w:szCs w:val="21"/>
+        </w:rPr>
+        <w:t xml:space="preserve">設定目標價逢低分批建倉：</w:t>
+      </w:r>
+      <w:r>
+        <w:rPr>
+          <w:rFonts w:ascii="Microsoft JhengHei" w:cs="Microsoft JhengHei" w:eastAsia="Microsoft JhengHei" w:hAnsi="Microsoft JhengHei"/>
+          <w:sz w:val="21"/>
+          <w:szCs w:val="21"/>
+        </w:rPr>
+        <w:t xml:space="preserve"> 若公司財務策略本即規劃以特定價位分批累積 BTC 現貨儲備，可透過「低買」結構於等待建倉價位期間同時賺取權利金，等同於「限價單 + 額外收益」之複合工具。</w:t>
+      </w:r>
+    </w:p>
+    <w:p>
+      <w:pPr>
+        <w:spacing w:after="160" w:line="300"/>
+      </w:pPr>
+      <w:r>
+        <w:rPr>
+          <w:rFonts w:ascii="Microsoft JhengHei" w:cs="Microsoft JhengHei" w:eastAsia="Microsoft JhengHei" w:hAnsi="Microsoft JhengHei"/>
+          <w:sz w:val="21"/>
+          <w:szCs w:val="21"/>
+        </w:rPr>
+        <w:t xml:space="preserve">2. </w:t>
+      </w:r>
+      <w:r>
+        <w:rPr>
+          <w:rFonts w:ascii="Microsoft JhengHei" w:cs="Microsoft JhengHei" w:eastAsia="Microsoft JhengHei" w:hAnsi="Microsoft JhengHei"/>
+          <w:b/>
+          <w:bCs/>
+          <w:sz w:val="21"/>
+          <w:szCs w:val="21"/>
+        </w:rPr>
         <w:t xml:space="preserve">震盪市掛深度價外（OTM 10%+）收益增強：</w:t>
       </w:r>
       <w:r>
@@ -7503,6 +9684,37 @@
           <w:szCs w:val="21"/>
         </w:rPr>
         <w:t xml:space="preserve"> 於預期標的價格窄幅震盪之市場環境，可將行使價設定於顯著價外（例如 -10% 以上），大幅降低轉換機率，以較低年化換取較高之本金安全邊際。</w:t>
+      </w:r>
+    </w:p>
+    <w:p>
+      <w:pPr>
+        <w:spacing w:after="160" w:line="300"/>
+      </w:pPr>
+      <w:r>
+        <w:rPr>
+          <w:rFonts w:ascii="Microsoft JhengHei" w:cs="Microsoft JhengHei" w:eastAsia="Microsoft JhengHei" w:hAnsi="Microsoft JhengHei"/>
+          <w:sz w:val="21"/>
+          <w:szCs w:val="21"/>
+        </w:rPr>
+        <w:t xml:space="preserve">3. </w:t>
+      </w:r>
+      <w:r>
+        <w:rPr>
+          <w:rFonts w:ascii="Microsoft JhengHei" w:cs="Microsoft JhengHei" w:eastAsia="Microsoft JhengHei" w:hAnsi="Microsoft JhengHei"/>
+          <w:b/>
+          <w:bCs/>
+          <w:sz w:val="21"/>
+          <w:szCs w:val="21"/>
+        </w:rPr>
+        <w:t xml:space="preserve">轉換後之滾動掛單（見 6.4 節）：</w:t>
+      </w:r>
+      <w:r>
+        <w:rPr>
+          <w:rFonts w:ascii="Microsoft JhengHei" w:cs="Microsoft JhengHei" w:eastAsia="Microsoft JhengHei" w:hAnsi="Microsoft JhengHei"/>
+          <w:sz w:val="21"/>
+          <w:szCs w:val="21"/>
+        </w:rPr>
+        <w:t xml:space="preserve"> 作為單一週期觸價後之後續管理選項，惟應同步將 6.4.2 節之三項限制納入內部 SOP 與風險揭露，避免第一線交易人員以「不會虧錢」之簡化說法向財務部或風控委員會報告部位狀態。</w:t>
       </w:r>
     </w:p>
     <w:p>
@@ -8306,6 +10518,55 @@
           <w:szCs w:val="21"/>
         </w:rPr>
         <w:t xml:space="preserve">，避免於單邊持續下跌行情中被迫連續多期以不利價格承接貶值資產。</w:t>
+      </w:r>
+    </w:p>
+    <w:p>
+      <w:pPr>
+        <w:spacing w:after="160" w:line="300"/>
+      </w:pPr>
+      <w:r>
+        <w:rPr>
+          <w:rFonts w:ascii="Microsoft JhengHei" w:cs="Microsoft JhengHei" w:eastAsia="Microsoft JhengHei" w:hAnsi="Microsoft JhengHei"/>
+          <w:sz w:val="21"/>
+          <w:szCs w:val="21"/>
+        </w:rPr>
+        <w:t xml:space="preserve">3. </w:t>
+      </w:r>
+      <w:r>
+        <w:rPr>
+          <w:rFonts w:ascii="Microsoft JhengHei" w:cs="Microsoft JhengHei" w:eastAsia="Microsoft JhengHei" w:hAnsi="Microsoft JhengHei"/>
+          <w:b/>
+          <w:bCs/>
+          <w:sz w:val="21"/>
+          <w:szCs w:val="21"/>
+        </w:rPr>
+        <w:t xml:space="preserve">轉換後之滾動掛單：</w:t>
+      </w:r>
+      <w:r>
+        <w:rPr>
+          <w:rFonts w:ascii="Microsoft JhengHei" w:cs="Microsoft JhengHei" w:eastAsia="Microsoft JhengHei" w:hAnsi="Microsoft JhengHei"/>
+          <w:sz w:val="21"/>
+          <w:szCs w:val="21"/>
+        </w:rPr>
+        <w:t xml:space="preserve"> 第 6.4 節針對 OKX 所述之「轉換後固定原行使價滾動掛單」策略，其金融工程邏輯與限制（權利金隨套牢加深而遞減、未實現損失之會計認列）於 Binance 雙幣投資完全適用；Binance 之 Auto-Compound「基礎方案」實質上即為此策略之</w:t>
+      </w:r>
+      <w:r>
+        <w:rPr>
+          <w:rFonts w:ascii="Microsoft JhengHei" w:cs="Microsoft JhengHei" w:eastAsia="Microsoft JhengHei" w:hAnsi="Microsoft JhengHei"/>
+          <w:b/>
+          <w:bCs/>
+          <w:sz w:val="21"/>
+          <w:szCs w:val="21"/>
+        </w:rPr>
+        <w:t xml:space="preserve">平台自動化版本</w:t>
+      </w:r>
+      <w:r>
+        <w:rPr>
+          <w:rFonts w:ascii="Microsoft JhengHei" w:cs="Microsoft JhengHei" w:eastAsia="Microsoft JhengHei" w:hAnsi="Microsoft JhengHei"/>
+          <w:sz w:val="21"/>
+          <w:szCs w:val="21"/>
+        </w:rPr>
+        <w:t xml:space="preserve">，財務部審查時應一併適用 6.4.2 節之三項限制。</w:t>
       </w:r>
     </w:p>
     <w:p>
@@ -11154,7 +13415,25 @@
           <w:sz w:val="21"/>
           <w:szCs w:val="21"/>
         </w:rPr>
-        <w:t xml:space="preserve">計算，未反映第 6、7 章情境試算中所示之觸價本金轉換損失；若納入機率加權情境分析（參考第 6.3 節示意 EV 方法論），實際已實現之綜合年化將視市場波動與觸價機率而顯著偏離本表所示數字，甚至於單一結算週期內轉為負值。</w:t>
+        <w:t xml:space="preserve">計算，未反映第 6、7 章情境試算中所示之觸價本金轉換損失；若納入機率加權情境分析（參考第 6.3 節示意 EV 方法論），實際已實現之綜合年化將視市場波動與觸價機率而顯著偏離本表所示數字，甚至於單一結算週期內轉為負值。第 6.4 節所述之「轉換後滾動掛單」策略可於價格回升情境下部分彌補此落差，惟同樣附帶權利金遞減與未實現損失之限制（詳見 6.4.2 節），本表數字</w:t>
+      </w:r>
+      <w:r>
+        <w:rPr>
+          <w:rFonts w:ascii="Microsoft JhengHei" w:cs="Microsoft JhengHei" w:eastAsia="Microsoft JhengHei" w:hAnsi="Microsoft JhengHei"/>
+          <w:b/>
+          <w:bCs/>
+          <w:sz w:val="21"/>
+          <w:szCs w:val="21"/>
+        </w:rPr>
+        <w:t xml:space="preserve">未</w:t>
+      </w:r>
+      <w:r>
+        <w:rPr>
+          <w:rFonts w:ascii="Microsoft JhengHei" w:cs="Microsoft JhengHei" w:eastAsia="Microsoft JhengHei" w:hAnsi="Microsoft JhengHei"/>
+          <w:sz w:val="21"/>
+          <w:szCs w:val="21"/>
+        </w:rPr>
+        <w:t xml:space="preserve">假設交易員必然採用該後續管理策略。</w:t>
       </w:r>
     </w:p>
     <w:p>

</xml_diff>